<commit_message>
Simplify practice 5 controls and update DOCX report
</commit_message>
<xml_diff>
--- a/docs/ЛиньковМВ_ПР5_РКПДР.docx
+++ b/docs/ЛиньковМВ_ПР5_РКПДР.docx
@@ -2203,7 +2203,7 @@
         <w:rPr/>
       </w:pPr>
       <w:r>
-        <w:t xml:space="preserve">Цель работы: разработка WebAR-приложения на Three.js с расширенным интерфейсом (HTML5 UI), PBR-освещением окружения (HDRI/IBL) и интерактивным управлением свойствами 3D-объектов.</w:t>
+        <w:t>Цель работы: расширение WebAR-сцены на Three.js средствами управления объектом, PBR-материалами и освещением через карту окружения.</w:t>
       </w:r>
       <w:r/>
     </w:p>
@@ -2247,7 +2247,7 @@
         <w:rPr/>
       </w:pPr>
       <w:r>
-        <w:t xml:space="preserve">– спроектировать адаптивный HTML5 UI-оверлей поверх WebXR-холста с поддержкой событий взаимодействия;</w:t>
+        <w:t>– добавить стандартные HTML-кнопки, поле выбора цвета и селектор модели поверх WebXR-холста;</w:t>
       </w:r>
       <w:r/>
     </w:p>
@@ -2260,7 +2260,7 @@
         <w:rPr/>
       </w:pPr>
       <w:r>
-        <w:t xml:space="preserve">– реализовать модульную архитектуру системы с выделением классов управления освещением, моделями и сессией;</w:t>
+        <w:t>– разделить код на классы освещения, модели, элементов управления и AR-сцены;</w:t>
       </w:r>
       <w:r/>
     </w:p>
@@ -2286,7 +2286,7 @@
         <w:rPr/>
       </w:pPr>
       <w:r>
-        <w:t xml:space="preserve">– обеспечить интерактивное вращение, переключение геометрических форм и динамическую смену цвета в HTTPS.</w:t>
+        <w:t>– реализовать поворот объекта, смену цвета и замену модели с сохранением точки размещения;</w:t>
       </w:r>
       <w:r/>
     </w:p>
@@ -2331,15 +2331,8 @@
         <w:rPr/>
       </w:pPr>
       <w:r>
-        <w:t xml:space="preserve">Для выполнения практической работы разработано модульное WebAR-приложение на базе Three.js и WebXR Device API. Архитектура решения декомпозирована на специ</w:t>
+        <w:t>Приложение реализовано в одном файле index.html на Three.js r128 и WebXR. Класс Lighting создаёт карту окружения через PMREMGenerator и назначает её scene.environment. Класс Model создаёт куб или торический узел с материалом MeshStandardMaterial (roughness = 0.25, metalness = 0.65). Класс Controls обрабатывает элементы управления, а ARApp управляет сессией immersive-ar, системой координат local-floor, hit-test и размещением объекта. Полный код приведён в листинге 1.</w:t>
       </w:r>
-      <w:r>
-        <w:t xml:space="preserve">ализированные классы: EnvLightingManager отвечает за настройку PBR-освещения и генерацию текстуры окружения через PMREMGenerator, ModelManager инкапсулирует логику создания трехмерных мешей (цилиндр, тор, сфера), управления параметрами шероховатости (rough</w:t>
-      </w:r>
-      <w:r>
-        <w:t xml:space="preserve">ness: 0.25) и металличности (metalness: 0.85), а также динамической смены цвета и вращения. Модуль ARSessionManager управляет жизненным циклом сессии immersive-ar, системой координат local-floor и зондированием плоскостей через XRHitTestSource (листинг 1).</w:t>
-      </w:r>
-      <w:r/>
     </w:p>
     <w:p>
       <w:pPr>
@@ -2376,6 +2369,8 @@
           </w:tcPr>
           <w:p>
             <w:pPr>
+              <w:keepNext w:val="0"/>
+              <w:keepLines w:val="0"/>
               <w:pBdr/>
               <w:spacing w:after="0" w:before="0" w:line="240" w:lineRule="auto"/>
               <w:ind w:firstLine="0"/>
@@ -2384,1509 +2379,325 @@
             </w:pPr>
             <w:r>
               <w:rPr>
-                <w:rFonts w:ascii="Courier New" w:hAnsi="Courier New"/>
+                <w:rFonts w:ascii="Courier New" w:hAnsi="Courier New" w:cs="Courier New" w:eastAsia="Courier New"/>
                 <w:sz w:val="20"/>
               </w:rPr>
-              <w:t xml:space="preserve">&lt;!DOCTYPE html&gt;</w:t>
-            </w:r>
-            <w:r/>
-          </w:p>
-          <w:p>
-            <w:pPr>
-              <w:pBdr/>
-              <w:spacing w:after="0" w:before="0" w:line="240" w:lineRule="auto"/>
-              <w:ind w:firstLine="0"/>
-              <w:jc w:val="left"/>
-              <w:rPr/>
-            </w:pPr>
-            <w:r>
-              <w:rPr>
-                <w:rFonts w:ascii="Courier New" w:hAnsi="Courier New"/>
-                <w:sz w:val="20"/>
-              </w:rPr>
-              <w:t xml:space="preserve">&lt;html lang="ru"&gt;</w:t>
-            </w:r>
-            <w:r/>
-          </w:p>
-          <w:p>
-            <w:pPr>
-              <w:pBdr/>
-              <w:spacing w:after="0" w:before="0" w:line="240" w:lineRule="auto"/>
-              <w:ind w:firstLine="0"/>
-              <w:jc w:val="left"/>
-              <w:rPr/>
-            </w:pPr>
-            <w:r>
-              <w:rPr>
-                <w:rFonts w:ascii="Courier New" w:hAnsi="Courier New"/>
-                <w:sz w:val="20"/>
-              </w:rPr>
-              <w:t xml:space="preserve">&lt;head&gt;</w:t>
-            </w:r>
-            <w:r/>
-          </w:p>
-          <w:p>
-            <w:pPr>
-              <w:pBdr/>
-              <w:spacing w:after="0" w:before="0" w:line="240" w:lineRule="auto"/>
-              <w:ind w:firstLine="0"/>
-              <w:jc w:val="left"/>
-              <w:rPr/>
-            </w:pPr>
-            <w:r>
-              <w:rPr>
-                <w:rFonts w:ascii="Courier New" w:hAnsi="Courier New"/>
-                <w:sz w:val="20"/>
-              </w:rPr>
-              <w:t xml:space="preserve">    &lt;meta charset="UTF-8"&gt;</w:t>
-            </w:r>
-            <w:r/>
-          </w:p>
-          <w:p>
-            <w:pPr>
-              <w:pBdr/>
-              <w:spacing w:after="0" w:before="0" w:line="240" w:lineRule="auto"/>
-              <w:ind w:firstLine="0"/>
-              <w:jc w:val="left"/>
-              <w:rPr/>
-            </w:pPr>
-            <w:r>
-              <w:rPr>
-                <w:rFonts w:ascii="Courier New" w:hAnsi="Courier New"/>
-                <w:sz w:val="20"/>
-              </w:rPr>
-              <w:t xml:space="preserve">    &lt;meta name="viewport" content="width=device-width, initial-scale=1.0, user-scalable=no"&gt;</w:t>
-            </w:r>
-            <w:r/>
-          </w:p>
-          <w:p>
-            <w:pPr>
-              <w:pBdr/>
-              <w:spacing w:after="0" w:before="0" w:line="240" w:lineRule="auto"/>
-              <w:ind w:firstLine="0"/>
-              <w:jc w:val="left"/>
-              <w:rPr/>
-            </w:pPr>
-            <w:r>
-              <w:rPr>
-                <w:rFonts w:ascii="Courier New" w:hAnsi="Courier New"/>
-                <w:sz w:val="20"/>
-              </w:rPr>
-              <w:t xml:space="preserve">    &lt;title&gt;Three.js WebXR Interactive PBR Scene (ПР5)&lt;/title&gt;</w:t>
-            </w:r>
-            <w:r/>
-          </w:p>
-          <w:p>
-            <w:pPr>
-              <w:pBdr/>
-              <w:spacing w:after="0" w:before="0" w:line="240" w:lineRule="auto"/>
-              <w:ind w:firstLine="0"/>
-              <w:jc w:val="left"/>
-              <w:rPr/>
-            </w:pPr>
-            <w:r>
-              <w:rPr>
-                <w:rFonts w:ascii="Courier New" w:hAnsi="Courier New"/>
-                <w:sz w:val="20"/>
-              </w:rPr>
-              <w:t xml:space="preserve">    &lt;style&gt;</w:t>
-            </w:r>
-            <w:r/>
-          </w:p>
-          <w:p>
-            <w:pPr>
-              <w:pBdr/>
-              <w:spacing w:after="0" w:before="0" w:line="240" w:lineRule="auto"/>
-              <w:ind w:firstLine="0"/>
-              <w:jc w:val="left"/>
-              <w:rPr/>
-            </w:pPr>
-            <w:r>
-              <w:rPr>
-                <w:rFonts w:ascii="Courier New" w:hAnsi="Courier New"/>
-                <w:sz w:val="20"/>
-              </w:rPr>
-              <w:t xml:space="preserve">        * { box-sizing: border-box; -webkit-tap-highlight-color: transparent; } body { margin: 0; overflow: hidden; background: #0b0f19; font-family: -apple-system, sans-serif; }</w:t>
-            </w:r>
-            <w:r/>
-          </w:p>
-          <w:p>
-            <w:pPr>
-              <w:pBdr/>
-              <w:spacing w:after="0" w:before="0" w:line="240" w:lineRule="auto"/>
-              <w:ind w:firstLine="0"/>
-              <w:jc w:val="left"/>
-              <w:rPr/>
-            </w:pPr>
-            <w:r>
-              <w:rPr>
-                <w:rFonts w:ascii="Courier New" w:hAnsi="Courier New"/>
-                <w:sz w:val="20"/>
-              </w:rPr>
-              <w:t xml:space="preserve">        #ar-btn { position: fixed; top: 16px; left: 50%; transform: translateX(-50%); z-index: 30; padding: 10px 20px; font-weight: 600; background: #2563eb; color: #fff; border: 1px solid rgba(255,255,255,0.2); border-radius: 20px; cursor: pointer; }</w:t>
-            </w:r>
-            <w:r/>
-          </w:p>
-          <w:p>
-            <w:pPr>
-              <w:pBdr/>
-              <w:spacing w:after="0" w:before="0" w:line="240" w:lineRule="auto"/>
-              <w:ind w:firstLine="0"/>
-              <w:jc w:val="left"/>
-              <w:rPr/>
-            </w:pPr>
-            <w:r>
-              <w:rPr>
-                <w:rFonts w:ascii="Courier New" w:hAnsi="Courier New"/>
-                <w:sz w:val="20"/>
-              </w:rPr>
-              <w:t xml:space="preserve">        #ui-overlay { position: fixed; bottom: 16px; left: 16px; right: 16px; z-index: 20; display: flex; flex-direction: column; gap: 8px; background: rgba(15,23,42,0.85); backdrop-filter: blur(12px); border: 1px solid rgba(255,255,255,0.15); border-radius</w:t>
-            </w:r>
-            <w:r>
-              <w:rPr>
-                <w:rFonts w:ascii="Courier New" w:hAnsi="Courier New"/>
-                <w:sz w:val="20"/>
-              </w:rPr>
-              <w:t xml:space="preserve">: 14px; padding: 12px; color: #f8fafc; pointer-events: auto; }</w:t>
-            </w:r>
-            <w:r/>
-          </w:p>
-          <w:p>
-            <w:pPr>
-              <w:pBdr/>
-              <w:spacing w:after="0" w:before="0" w:line="240" w:lineRule="auto"/>
-              <w:ind w:firstLine="0"/>
-              <w:jc w:val="left"/>
-              <w:rPr/>
-            </w:pPr>
-            <w:r>
-              <w:rPr>
-                <w:rFonts w:ascii="Courier New" w:hAnsi="Courier New"/>
-                <w:sz w:val="20"/>
-              </w:rPr>
-              <w:t xml:space="preserve">        .ui-row { display: flex; align-items: center; justify-content: space-between; gap: 8px; } .c-dot { width: 22px; height: 22px; border-radius: 50%; border: 2px solid rgba(255,255,255,0.6); cursor: pointer; }</w:t>
-            </w:r>
-            <w:r/>
-          </w:p>
-          <w:p>
-            <w:pPr>
-              <w:pBdr/>
-              <w:spacing w:after="0" w:before="0" w:line="240" w:lineRule="auto"/>
-              <w:ind w:firstLine="0"/>
-              <w:jc w:val="left"/>
-              <w:rPr/>
-            </w:pPr>
-            <w:r>
-              <w:rPr>
-                <w:rFonts w:ascii="Courier New" w:hAnsi="Courier New"/>
-                <w:sz w:val="20"/>
-              </w:rPr>
-              <w:t xml:space="preserve">        .btn { padding: 5px 10px; border-radius: 8px; border: 1px solid rgba(255,255,255,0.15); background: rgba(255,255,255,0.08); color: #f8fafc; font-size: 11px; font-weight: 600; cursor: pointer; } .btn.active { background: #2563eb; border-color: #60a5f</w:t>
-            </w:r>
-            <w:r>
-              <w:rPr>
-                <w:rFonts w:ascii="Courier New" w:hAnsi="Courier New"/>
-                <w:sz w:val="20"/>
-              </w:rPr>
-              <w:t xml:space="preserve">a; }</w:t>
-            </w:r>
-            <w:r/>
-          </w:p>
-          <w:p>
-            <w:pPr>
-              <w:pBdr/>
-              <w:spacing w:after="0" w:before="0" w:line="240" w:lineRule="auto"/>
-              <w:ind w:firstLine="0"/>
-              <w:jc w:val="left"/>
-              <w:rPr/>
-            </w:pPr>
-            <w:r>
-              <w:rPr>
-                <w:rFonts w:ascii="Courier New" w:hAnsi="Courier New"/>
-                <w:sz w:val="20"/>
-              </w:rPr>
-              <w:t xml:space="preserve">    &lt;/style&gt;</w:t>
-            </w:r>
-            <w:r/>
-          </w:p>
-          <w:p>
-            <w:pPr>
-              <w:pBdr/>
-              <w:spacing w:after="0" w:before="0" w:line="240" w:lineRule="auto"/>
-              <w:ind w:firstLine="0"/>
-              <w:jc w:val="left"/>
-              <w:rPr/>
-            </w:pPr>
-            <w:r>
-              <w:rPr>
-                <w:rFonts w:ascii="Courier New" w:hAnsi="Courier New"/>
-                <w:sz w:val="20"/>
-              </w:rPr>
-              <w:t xml:space="preserve">    &lt;script src="https://cdnjs.cloudflare.com/ajax/libs/three.js/r128/three.min.js"&gt;&lt;/script&gt;</w:t>
-            </w:r>
-            <w:r/>
-          </w:p>
-          <w:p>
-            <w:pPr>
-              <w:pBdr/>
-              <w:spacing w:after="0" w:before="0" w:line="240" w:lineRule="auto"/>
-              <w:ind w:firstLine="0"/>
-              <w:jc w:val="left"/>
-              <w:rPr/>
-            </w:pPr>
-            <w:r>
-              <w:rPr>
-                <w:rFonts w:ascii="Courier New" w:hAnsi="Courier New"/>
-                <w:sz w:val="20"/>
-              </w:rPr>
-              <w:t xml:space="preserve">&lt;/head&gt;</w:t>
-            </w:r>
-            <w:r/>
-          </w:p>
-          <w:p>
-            <w:pPr>
-              <w:pBdr/>
-              <w:spacing w:after="0" w:before="0" w:line="240" w:lineRule="auto"/>
-              <w:ind w:firstLine="0"/>
-              <w:jc w:val="left"/>
-              <w:rPr/>
-            </w:pPr>
-            <w:r>
-              <w:rPr>
-                <w:rFonts w:ascii="Courier New" w:hAnsi="Courier New"/>
-                <w:sz w:val="20"/>
-              </w:rPr>
-              <w:t xml:space="preserve">&lt;body&gt;</w:t>
-            </w:r>
-            <w:r/>
-          </w:p>
-          <w:p>
-            <w:pPr>
-              <w:pBdr/>
-              <w:spacing w:after="0" w:before="0" w:line="240" w:lineRule="auto"/>
-              <w:ind w:firstLine="0"/>
-              <w:jc w:val="left"/>
-              <w:rPr/>
-            </w:pPr>
-            <w:r>
-              <w:rPr>
-                <w:rFonts w:ascii="Courier New" w:hAnsi="Courier New"/>
-                <w:sz w:val="20"/>
-              </w:rPr>
-              <w:t xml:space="preserve">    &lt;button id="ar-btn"&gt;Войти в AR&lt;/button&gt;</w:t>
-            </w:r>
-            <w:r/>
-          </w:p>
-          <w:p>
-            <w:pPr>
-              <w:pBdr/>
-              <w:spacing w:after="0" w:before="0" w:line="240" w:lineRule="auto"/>
-              <w:ind w:firstLine="0"/>
-              <w:jc w:val="left"/>
-              <w:rPr/>
-            </w:pPr>
-            <w:r>
-              <w:rPr>
-                <w:rFonts w:ascii="Courier New" w:hAnsi="Courier New"/>
-                <w:sz w:val="20"/>
-              </w:rPr>
-              <w:t xml:space="preserve">    &lt;div id="ui-overlay"&gt;</w:t>
-            </w:r>
-            <w:r/>
-          </w:p>
-          <w:p>
-            <w:pPr>
-              <w:pBdr/>
-              <w:spacing w:after="0" w:before="0" w:line="240" w:lineRule="auto"/>
-              <w:ind w:firstLine="0"/>
-              <w:jc w:val="left"/>
-              <w:rPr/>
-            </w:pPr>
-            <w:r>
-              <w:rPr>
-                <w:rFonts w:ascii="Courier New" w:hAnsi="Courier New"/>
-                <w:sz w:val="20"/>
-              </w:rPr>
-              <w:t xml:space="preserve">        &lt;div class="ui-row"&gt;&lt;span style="font-size:12px;font-weight:700;color:#93c5fd;"&gt;WebAR PBR Controller&lt;/span&gt;&lt;button id="btn-rotate" class="btn active"&gt;Вращение: Вкл&lt;/button&gt;&lt;/div&gt;</w:t>
-            </w:r>
-            <w:r/>
-          </w:p>
-          <w:p>
-            <w:pPr>
-              <w:pBdr/>
-              <w:spacing w:after="0" w:before="0" w:line="240" w:lineRule="auto"/>
-              <w:ind w:firstLine="0"/>
-              <w:jc w:val="left"/>
-              <w:rPr/>
-            </w:pPr>
-            <w:r>
-              <w:rPr>
-                <w:rFonts w:ascii="Courier New" w:hAnsi="Courier New"/>
-                <w:sz w:val="20"/>
-              </w:rPr>
-              <w:t xml:space="preserve">        &lt;div class="ui-row"&gt;&lt;span style="font-size:11px;color:#94a3b8;"&gt;Модель:&lt;/span&gt;&lt;div style="display:flex;gap:6px;"&gt;&lt;button class="btn active" onclick="app.modelManager.switchModel('cylinder')"&gt;Цилиндр&lt;/button&gt;&lt;button class="btn" onclick="app.modelMana</w:t>
-            </w:r>
-            <w:r>
-              <w:rPr>
-                <w:rFonts w:ascii="Courier New" w:hAnsi="Courier New"/>
-                <w:sz w:val="20"/>
-              </w:rPr>
-              <w:t xml:space="preserve">ger.switchModel('torus')"&gt;Тор&lt;/button&gt;&lt;button class="btn" onclick="app.modelManager.switchModel('sphere')"&gt;Сфера&lt;/button&gt;&lt;/div&gt;&lt;/div&gt;</w:t>
-            </w:r>
-            <w:r/>
-          </w:p>
-          <w:p>
-            <w:pPr>
-              <w:pBdr/>
-              <w:spacing w:after="0" w:before="0" w:line="240" w:lineRule="auto"/>
-              <w:ind w:firstLine="0"/>
-              <w:jc w:val="left"/>
-              <w:rPr/>
-            </w:pPr>
-            <w:r>
-              <w:rPr>
-                <w:rFonts w:ascii="Courier New" w:hAnsi="Courier New"/>
-                <w:sz w:val="20"/>
-              </w:rPr>
-              <w:t xml:space="preserve">        &lt;div class="ui-row"&gt;&lt;span style="font-size:11px;color:#94a3b8;"&gt;PBR цвет:&lt;/span&gt;&lt;div style="display:flex;gap:6px;"&gt;&lt;div class="c-dot" style="background:#3b82f6;" onclick="app.modelManager.setColor(0x3b82f6)"&gt;&lt;/div&gt;&lt;div class="c-dot" style="backgroun</w:t>
-            </w:r>
-            <w:r>
-              <w:rPr>
-                <w:rFonts w:ascii="Courier New" w:hAnsi="Courier New"/>
-                <w:sz w:val="20"/>
-              </w:rPr>
-              <w:t xml:space="preserve">d:#10b981;" onclick="app.modelManager.setColor(0x10b981)"&gt;&lt;/div&gt;&lt;div class="c-dot" style="background:#f59e0b;" onclick="app.modelManager.setColor(0xf59e0b)"&gt;&lt;/div&gt;&lt;div class="c-dot" style="background:#ef4444;" onclick="app.modelManager.setColor(0xef4444)"&gt;&lt;</w:t>
-            </w:r>
-            <w:r>
-              <w:rPr>
-                <w:rFonts w:ascii="Courier New" w:hAnsi="Courier New"/>
-                <w:sz w:val="20"/>
-              </w:rPr>
-              <w:t xml:space="preserve">/div&gt;&lt;div class="c-dot" style="background:#a855f7;" onclick="app.modelManager.setColor(0xa855f7)"&gt;&lt;/div&gt;&lt;/div&gt;&lt;/div&gt;</w:t>
-            </w:r>
-            <w:r/>
-          </w:p>
-          <w:p>
-            <w:pPr>
-              <w:pBdr/>
-              <w:spacing w:after="0" w:before="0" w:line="240" w:lineRule="auto"/>
-              <w:ind w:firstLine="0"/>
-              <w:jc w:val="left"/>
-              <w:rPr/>
-            </w:pPr>
-            <w:r>
-              <w:rPr>
-                <w:rFonts w:ascii="Courier New" w:hAnsi="Courier New"/>
-                <w:sz w:val="20"/>
-              </w:rPr>
+              <w:t>&lt;!DOCTYPE html&gt;</w:t>
+              <w:br/>
+              <w:t>&lt;html lang="ru"&gt;</w:t>
+              <w:br/>
+              <w:t>&lt;head&gt;</w:t>
+              <w:br/>
+              <w:t>&lt;meta charset="UTF-8"&gt;</w:t>
+              <w:br/>
+              <w:t>&lt;meta name="viewport" content="width=device-width, initial-scale=1"&gt;</w:t>
+              <w:br/>
+              <w:t>&lt;title&gt;Практика 5 — Three.js WebAR&lt;/title&gt;</w:t>
+              <w:br/>
+              <w:t>&lt;style&gt;</w:t>
+              <w:br/>
+              <w:t>body { margin: 0; }</w:t>
+              <w:br/>
+              <w:t>canvas { display: block; }</w:t>
+              <w:br/>
+              <w:t>#overlay { position: fixed; inset: 0; pointer-events: none; }</w:t>
+              <w:br/>
+              <w:t>#controls { position: absolute; top: 8px; left: 8px; right: 8px; pointer-events: auto; background: white; }</w:t>
+              <w:br/>
+              <w:t>&lt;/style&gt;</w:t>
+              <w:br/>
+              <w:t>&lt;script src="https://cdnjs.cloudflare.com/ajax/libs/three.js/r128/three.min.js"&gt;&lt;/script&gt;</w:t>
+              <w:br/>
+              <w:t>&lt;/head&gt;</w:t>
+              <w:br/>
+              <w:t>&lt;body&gt;</w:t>
+              <w:br/>
+              <w:t>&lt;div id="overlay"&gt;</w:t>
+              <w:br/>
+              <w:t xml:space="preserve">    &lt;div id="controls"&gt;</w:t>
+              <w:br/>
+              <w:t xml:space="preserve">        &lt;button id="ar" disabled&gt;Войти в AR&lt;/button&gt;</w:t>
+              <w:br/>
+              <w:t xml:space="preserve">        &lt;button id="left" aria-label="Повернуть влево на 15 градусов"&gt;−15°&lt;/button&gt;</w:t>
+              <w:br/>
+              <w:t xml:space="preserve">        &lt;button id="right" aria-label="Повернуть вправо на 15 градусов"&gt;+15°&lt;/button&gt;</w:t>
+              <w:br/>
+              <w:t xml:space="preserve">        &lt;label&gt;Цвет &lt;input id="color" type="color" value="#3b82f6"&gt;&lt;/label&gt;</w:t>
+              <w:br/>
+              <w:t xml:space="preserve">        &lt;label&gt;Модель &lt;select id="model"&gt;&lt;option value="box"&gt;Куб&lt;/option&gt;&lt;option value="knot"&gt;Узел&lt;/option&gt;&lt;/select&gt;&lt;/label&gt;</w:t>
+              <w:br/>
+              <w:t xml:space="preserve">        &lt;p id="status" role="status"&gt;Просмотр модели. Для AR наведите камеру на поверхность и коснитесь зелёного кольца.&lt;/p&gt;</w:t>
+              <w:br/>
               <w:t xml:space="preserve">    &lt;/div&gt;</w:t>
-            </w:r>
-            <w:r/>
-          </w:p>
-          <w:p>
-            <w:pPr>
-              <w:pBdr/>
-              <w:spacing w:after="0" w:before="0" w:line="240" w:lineRule="auto"/>
-              <w:ind w:firstLine="0"/>
-              <w:jc w:val="left"/>
-              <w:rPr/>
-            </w:pPr>
-            <w:r>
-              <w:rPr>
-                <w:rFonts w:ascii="Courier New" w:hAnsi="Courier New"/>
-                <w:sz w:val="20"/>
-              </w:rPr>
-              <w:t xml:space="preserve">    &lt;script&gt;</w:t>
-            </w:r>
-            <w:r/>
-          </w:p>
-          <w:p>
-            <w:pPr>
-              <w:pBdr/>
-              <w:spacing w:after="0" w:before="0" w:line="240" w:lineRule="auto"/>
-              <w:ind w:firstLine="0"/>
-              <w:jc w:val="left"/>
-              <w:rPr/>
-            </w:pPr>
-            <w:r>
-              <w:rPr>
-                <w:rFonts w:ascii="Courier New" w:hAnsi="Courier New"/>
-                <w:sz w:val="20"/>
-              </w:rPr>
-              <w:t xml:space="preserve">        class EnvLightingManager {</w:t>
-            </w:r>
-            <w:r/>
-          </w:p>
-          <w:p>
-            <w:pPr>
-              <w:pBdr/>
-              <w:spacing w:after="0" w:before="0" w:line="240" w:lineRule="auto"/>
-              <w:ind w:firstLine="0"/>
-              <w:jc w:val="left"/>
-              <w:rPr/>
-            </w:pPr>
-            <w:r>
-              <w:rPr>
-                <w:rFonts w:ascii="Courier New" w:hAnsi="Courier New"/>
-                <w:sz w:val="20"/>
-              </w:rPr>
-              <w:t xml:space="preserve">            constructor(scene, renderer) {</w:t>
-            </w:r>
-            <w:r/>
-          </w:p>
-          <w:p>
-            <w:pPr>
-              <w:pBdr/>
-              <w:spacing w:after="0" w:before="0" w:line="240" w:lineRule="auto"/>
-              <w:ind w:firstLine="0"/>
-              <w:jc w:val="left"/>
-              <w:rPr/>
-            </w:pPr>
-            <w:r>
-              <w:rPr>
-                <w:rFonts w:ascii="Courier New" w:hAnsi="Courier New"/>
-                <w:sz w:val="20"/>
-              </w:rPr>
-              <w:t xml:space="preserve">                scene.add(new THREE.HemisphereLight(0xffffff, 0x334455, 1.2)); scene.add(new THREE.DirectionalLight(0xffffff, 1.5).position.set(2, 4, 2));</w:t>
-            </w:r>
-            <w:r/>
-          </w:p>
-          <w:p>
-            <w:pPr>
-              <w:pBdr/>
-              <w:spacing w:after="0" w:before="0" w:line="240" w:lineRule="auto"/>
-              <w:ind w:firstLine="0"/>
-              <w:jc w:val="left"/>
-              <w:rPr/>
-            </w:pPr>
-            <w:r>
-              <w:rPr>
-                <w:rFonts w:ascii="Courier New" w:hAnsi="Courier New"/>
-                <w:sz w:val="20"/>
-              </w:rPr>
-              <w:t xml:space="preserve">                const env = new THREE.Scene(); env.add(new THREE.HemisphereLight(0xaaccff, 0x223344, 2)); scene.environment = new THREE.PMREMGenerator(renderer).fromScene(env, 0.04).texture;</w:t>
-            </w:r>
-            <w:r/>
-          </w:p>
-          <w:p>
-            <w:pPr>
-              <w:pBdr/>
-              <w:spacing w:after="0" w:before="0" w:line="240" w:lineRule="auto"/>
-              <w:ind w:firstLine="0"/>
-              <w:jc w:val="left"/>
-              <w:rPr/>
-            </w:pPr>
-            <w:r>
-              <w:rPr>
-                <w:rFonts w:ascii="Courier New" w:hAnsi="Courier New"/>
-                <w:sz w:val="20"/>
-              </w:rPr>
-              <w:t xml:space="preserve">            }</w:t>
-            </w:r>
-            <w:r/>
-          </w:p>
-          <w:p>
-            <w:pPr>
-              <w:pBdr/>
-              <w:spacing w:after="0" w:before="0" w:line="240" w:lineRule="auto"/>
-              <w:ind w:firstLine="0"/>
-              <w:jc w:val="left"/>
-              <w:rPr/>
-            </w:pPr>
-            <w:r>
-              <w:rPr>
-                <w:rFonts w:ascii="Courier New" w:hAnsi="Courier New"/>
-                <w:sz w:val="20"/>
-              </w:rPr>
+              <w:br/>
+              <w:t>&lt;/div&gt;</w:t>
+              <w:br/>
+              <w:t>&lt;script&gt;</w:t>
+              <w:br/>
+              <w:t>const element = id =&gt; document.getElementById(id);</w:t>
+              <w:br/>
+              <w:br/>
+              <w:t>class Lighting {</w:t>
+              <w:br/>
+              <w:t xml:space="preserve">    constructor(scene, renderer) {</w:t>
+              <w:br/>
+              <w:t xml:space="preserve">        const studio = new THREE.Scene();</w:t>
+              <w:br/>
+              <w:t xml:space="preserve">        studio.background = new THREE.Color(0x888888);</w:t>
+              <w:br/>
+              <w:t xml:space="preserve">        const panel = new THREE.Mesh(new THREE.BoxGeometry(4, 0.1, 4), new THREE.MeshBasicMaterial({ color: 0xffffff }));</w:t>
+              <w:br/>
+              <w:t xml:space="preserve">        panel.position.set(-1, 3, 0);</w:t>
+              <w:br/>
+              <w:t xml:space="preserve">        studio.add(panel);</w:t>
+              <w:br/>
+              <w:t xml:space="preserve">        const generator = new THREE.PMREMGenerator(renderer);</w:t>
+              <w:br/>
+              <w:t xml:space="preserve">        scene.environment = generator.fromScene(studio).texture;</w:t>
+              <w:br/>
+              <w:t xml:space="preserve">        generator.dispose();</w:t>
+              <w:br/>
+              <w:t xml:space="preserve">        panel.geometry.dispose();</w:t>
+              <w:br/>
+              <w:t xml:space="preserve">        panel.material.dispose();</w:t>
+              <w:br/>
+              <w:t xml:space="preserve">    }</w:t>
+              <w:br/>
+              <w:t>}</w:t>
+              <w:br/>
+              <w:br/>
+              <w:t>class Model {</w:t>
+              <w:br/>
+              <w:t xml:space="preserve">    constructor(scene) {</w:t>
+              <w:br/>
+              <w:t xml:space="preserve">        this.root = new THREE.Group();</w:t>
+              <w:br/>
+              <w:t xml:space="preserve">        this.material = new THREE.MeshStandardMaterial({ color: '#3b82f6', roughness: 0.25, metalness: 0.65 });</w:t>
+              <w:br/>
+              <w:t xml:space="preserve">        this.set('box');</w:t>
+              <w:br/>
+              <w:t xml:space="preserve">        scene.add(this.root);</w:t>
+              <w:br/>
+              <w:t xml:space="preserve">    }</w:t>
+              <w:br/>
+              <w:t xml:space="preserve">    set(kind) {</w:t>
+              <w:br/>
+              <w:t xml:space="preserve">        if (this.mesh) {</w:t>
+              <w:br/>
+              <w:t xml:space="preserve">            this.root.remove(this.mesh);</w:t>
+              <w:br/>
+              <w:t xml:space="preserve">            this.mesh.geometry.dispose();</w:t>
+              <w:br/>
               <w:t xml:space="preserve">        }</w:t>
-            </w:r>
-            <w:r/>
-          </w:p>
-          <w:p>
-            <w:pPr>
-              <w:pBdr/>
-              <w:spacing w:after="0" w:before="0" w:line="240" w:lineRule="auto"/>
-              <w:ind w:firstLine="0"/>
-              <w:jc w:val="left"/>
-              <w:rPr/>
-            </w:pPr>
-            <w:r>
-              <w:rPr>
-                <w:rFonts w:ascii="Courier New" w:hAnsi="Courier New"/>
-                <w:sz w:val="20"/>
-              </w:rPr>
-              <w:t xml:space="preserve">        class ModelManager {</w:t>
-            </w:r>
-            <w:r/>
-          </w:p>
-          <w:p>
-            <w:pPr>
-              <w:pBdr/>
-              <w:spacing w:after="0" w:before="0" w:line="240" w:lineRule="auto"/>
-              <w:ind w:firstLine="0"/>
-              <w:jc w:val="left"/>
-              <w:rPr/>
-            </w:pPr>
-            <w:r>
-              <w:rPr>
-                <w:rFonts w:ascii="Courier New" w:hAnsi="Courier New"/>
-                <w:sz w:val="20"/>
-              </w:rPr>
-              <w:t xml:space="preserve">            constructor(scene) { this.currentType = 'cylinder'; this.isRotating = true; this.material = new THREE.MeshStandardMaterial({ color: 0x3b82f6, roughness: 0.25, metalness: 0.85 }); this.rootGroup = new THREE.Group(); scene.add(this.rootGroup); thi</w:t>
-            </w:r>
-            <w:r>
-              <w:rPr>
-                <w:rFonts w:ascii="Courier New" w:hAnsi="Courier New"/>
-                <w:sz w:val="20"/>
-              </w:rPr>
-              <w:t xml:space="preserve">s.rebuildMesh(); }</w:t>
-            </w:r>
-            <w:r/>
-          </w:p>
-          <w:p>
-            <w:pPr>
-              <w:pBdr/>
-              <w:spacing w:after="0" w:before="0" w:line="240" w:lineRule="auto"/>
-              <w:ind w:firstLine="0"/>
-              <w:jc w:val="left"/>
-              <w:rPr/>
-            </w:pPr>
-            <w:r>
-              <w:rPr>
-                <w:rFonts w:ascii="Courier New" w:hAnsi="Courier New"/>
-                <w:sz w:val="20"/>
-              </w:rPr>
-              <w:t xml:space="preserve">            rebuildMesh() {</w:t>
-            </w:r>
-            <w:r/>
-          </w:p>
-          <w:p>
-            <w:pPr>
-              <w:pBdr/>
-              <w:spacing w:after="0" w:before="0" w:line="240" w:lineRule="auto"/>
-              <w:ind w:firstLine="0"/>
-              <w:jc w:val="left"/>
-              <w:rPr/>
-            </w:pPr>
-            <w:r>
-              <w:rPr>
-                <w:rFonts w:ascii="Courier New" w:hAnsi="Courier New"/>
-                <w:sz w:val="20"/>
-              </w:rPr>
-              <w:t xml:space="preserve">                if (this.mesh) this.rootGroup.remove(this.mesh);</w:t>
-            </w:r>
-            <w:r/>
-          </w:p>
-          <w:p>
-            <w:pPr>
-              <w:pBdr/>
-              <w:spacing w:after="0" w:before="0" w:line="240" w:lineRule="auto"/>
-              <w:ind w:firstLine="0"/>
-              <w:jc w:val="left"/>
-              <w:rPr/>
-            </w:pPr>
-            <w:r>
-              <w:rPr>
-                <w:rFonts w:ascii="Courier New" w:hAnsi="Courier New"/>
-                <w:sz w:val="20"/>
-              </w:rPr>
-              <w:t xml:space="preserve">                let geo = this.currentType === 'cylinder' ? new THREE.CylinderGeometry(0.12, 0.12, 0.25, 32) : (this.currentType === 'torus' ? new THREE.TorusGeometry(0.12, 0.045, 24, 48) : new THREE.SphereGeometry(0.13, 32, 24));</w:t>
-            </w:r>
-            <w:r/>
-          </w:p>
-          <w:p>
-            <w:pPr>
-              <w:pBdr/>
-              <w:spacing w:after="0" w:before="0" w:line="240" w:lineRule="auto"/>
-              <w:ind w:firstLine="0"/>
-              <w:jc w:val="left"/>
-              <w:rPr/>
-            </w:pPr>
-            <w:r>
-              <w:rPr>
-                <w:rFonts w:ascii="Courier New" w:hAnsi="Courier New"/>
-                <w:sz w:val="20"/>
-              </w:rPr>
-              <w:t xml:space="preserve">                this.mesh = new THREE.Mesh(geo, this.material); this.mesh.position.y = 0.13; this.rootGroup.add(this.mesh);</w:t>
-            </w:r>
-            <w:r/>
-          </w:p>
-          <w:p>
-            <w:pPr>
-              <w:pBdr/>
-              <w:spacing w:after="0" w:before="0" w:line="240" w:lineRule="auto"/>
-              <w:ind w:firstLine="0"/>
-              <w:jc w:val="left"/>
-              <w:rPr/>
-            </w:pPr>
-            <w:r>
-              <w:rPr>
-                <w:rFonts w:ascii="Courier New" w:hAnsi="Courier New"/>
-                <w:sz w:val="20"/>
-              </w:rPr>
-              <w:t xml:space="preserve">            }</w:t>
-            </w:r>
-            <w:r/>
-          </w:p>
-          <w:p>
-            <w:pPr>
-              <w:pBdr/>
-              <w:spacing w:after="0" w:before="0" w:line="240" w:lineRule="auto"/>
-              <w:ind w:firstLine="0"/>
-              <w:jc w:val="left"/>
-              <w:rPr/>
-            </w:pPr>
-            <w:r>
-              <w:rPr>
-                <w:rFonts w:ascii="Courier New" w:hAnsi="Courier New"/>
-                <w:sz w:val="20"/>
-              </w:rPr>
-              <w:t xml:space="preserve">            switchModel(t) { this.currentType = t; this.rebuildMesh(); } setColor(c) { this.material.color.setHex(c); } update(dt) { if (this.isRotating &amp;&amp; this.mesh) this.mesh.rotation.y += dt * 1.2; }</w:t>
-            </w:r>
-            <w:r/>
-          </w:p>
-          <w:p>
-            <w:pPr>
-              <w:pBdr/>
-              <w:spacing w:after="0" w:before="0" w:line="240" w:lineRule="auto"/>
-              <w:ind w:firstLine="0"/>
-              <w:jc w:val="left"/>
-              <w:rPr/>
-            </w:pPr>
-            <w:r>
-              <w:rPr>
-                <w:rFonts w:ascii="Courier New" w:hAnsi="Courier New"/>
-                <w:sz w:val="20"/>
-              </w:rPr>
+              <w:br/>
+              <w:t xml:space="preserve">        const geometry = kind === 'box' ? new THREE.BoxGeometry(0.24, 0.24, 0.24) : new THREE.TorusKnotGeometry(0.09, 0.025, 96, 16);</w:t>
+              <w:br/>
+              <w:t xml:space="preserve">        geometry.computeBoundingBox();</w:t>
+              <w:br/>
+              <w:t xml:space="preserve">        this.mesh = new THREE.Mesh(geometry, this.material);</w:t>
+              <w:br/>
+              <w:t xml:space="preserve">        this.mesh.position.y = -geometry.boundingBox.min.y;</w:t>
+              <w:br/>
+              <w:t xml:space="preserve">        this.root.add(this.mesh);</w:t>
+              <w:br/>
+              <w:t xml:space="preserve">    }</w:t>
+              <w:br/>
+              <w:t>}</w:t>
+              <w:br/>
+              <w:br/>
+              <w:t>class Controls {</w:t>
+              <w:br/>
+              <w:t xml:space="preserve">    constructor(model) {</w:t>
+              <w:br/>
+              <w:t xml:space="preserve">        element('left').onclick = () =&gt; model.root.rotation.y -= Math.PI / 12;</w:t>
+              <w:br/>
+              <w:t xml:space="preserve">        element('right').onclick = () =&gt; model.root.rotation.y += Math.PI / 12;</w:t>
+              <w:br/>
+              <w:t xml:space="preserve">        element('color').oninput = event =&gt; model.material.color.set(event.target.value);</w:t>
+              <w:br/>
+              <w:t xml:space="preserve">        element('model').onchange = event =&gt; model.set(event.target.value);</w:t>
+              <w:br/>
+              <w:t xml:space="preserve">        element('controls').addEventListener('beforexrselect', event =&gt; event.preventDefault());</w:t>
+              <w:br/>
+              <w:t xml:space="preserve">    }</w:t>
+              <w:br/>
+              <w:t>}</w:t>
+              <w:br/>
+              <w:br/>
+              <w:t>class ARApp {</w:t>
+              <w:br/>
+              <w:t xml:space="preserve">    constructor() {</w:t>
+              <w:br/>
+              <w:t xml:space="preserve">        this.scene = new THREE.Scene();</w:t>
+              <w:br/>
+              <w:t xml:space="preserve">        this.camera = new THREE.PerspectiveCamera(50, innerWidth / innerHeight, 0.01, 30);</w:t>
+              <w:br/>
+              <w:t xml:space="preserve">        this.renderer = new THREE.WebGLRenderer({ antialias: true, alpha: true });</w:t>
+              <w:br/>
+              <w:t xml:space="preserve">        this.renderer.setSize(innerWidth, innerHeight);</w:t>
+              <w:br/>
+              <w:t xml:space="preserve">        this.renderer.outputEncoding = THREE.sRGBEncoding;</w:t>
+              <w:br/>
+              <w:t xml:space="preserve">        this.renderer.xr.enabled = true;</w:t>
+              <w:br/>
+              <w:t xml:space="preserve">        this.renderer.xr.setReferenceSpaceType('local-floor');</w:t>
+              <w:br/>
+              <w:t xml:space="preserve">        document.body.appendChild(this.renderer.domElement);</w:t>
+              <w:br/>
+              <w:t xml:space="preserve">        new Lighting(this.scene, this.renderer);</w:t>
+              <w:br/>
+              <w:t xml:space="preserve">        this.model = new Model(this.scene);</w:t>
+              <w:br/>
+              <w:t xml:space="preserve">        new Controls(this.model);</w:t>
+              <w:br/>
+              <w:t xml:space="preserve">        this.reticle = new THREE.Mesh(new THREE.RingGeometry(0.1, 0.13, 32).rotateX(-Math.PI / 2), new THREE.MeshBasicMaterial({ color: 0x00aa00, side: THREE.DoubleSide }));</w:t>
+              <w:br/>
+              <w:t xml:space="preserve">        this.reticle.matrixAutoUpdate = false;</w:t>
+              <w:br/>
+              <w:t xml:space="preserve">        this.reticle.visible = false;</w:t>
+              <w:br/>
+              <w:t xml:space="preserve">        this.scene.add(this.reticle);</w:t>
+              <w:br/>
+              <w:t xml:space="preserve">        const controller = this.renderer.xr.getController(0);</w:t>
+              <w:br/>
+              <w:t xml:space="preserve">        controller.addEventListener('select', () =&gt; this.place());</w:t>
+              <w:br/>
+              <w:t xml:space="preserve">        this.scene.add(controller);</w:t>
+              <w:br/>
+              <w:t xml:space="preserve">        element('ar').onclick = () =&gt; this.toggleAR();</w:t>
+              <w:br/>
+              <w:t xml:space="preserve">        this.renderer.xr.addEventListener('sessionend', () =&gt; this.preview());</w:t>
+              <w:br/>
+              <w:t xml:space="preserve">        this.preview();</w:t>
+              <w:br/>
+              <w:t xml:space="preserve">        if (isSecureContext &amp;&amp; navigator.xr) {</w:t>
+              <w:br/>
+              <w:t xml:space="preserve">            navigator.xr.isSessionSupported('immersive-ar').then(supported =&gt; { element('ar').disabled = !supported; }).catch(() =&gt; {});</w:t>
+              <w:br/>
               <w:t xml:space="preserve">        }</w:t>
-            </w:r>
-            <w:r/>
-          </w:p>
-          <w:p>
-            <w:pPr>
-              <w:pBdr/>
-              <w:spacing w:after="0" w:before="0" w:line="240" w:lineRule="auto"/>
-              <w:ind w:firstLine="0"/>
-              <w:jc w:val="left"/>
-              <w:rPr/>
-            </w:pPr>
-            <w:r>
-              <w:rPr>
-                <w:rFonts w:ascii="Courier New" w:hAnsi="Courier New"/>
-                <w:sz w:val="20"/>
-              </w:rPr>
-              <w:t xml:space="preserve">        class ARSessionManager {</w:t>
-            </w:r>
-            <w:r/>
-          </w:p>
-          <w:p>
-            <w:pPr>
-              <w:pBdr/>
-              <w:spacing w:after="0" w:before="0" w:line="240" w:lineRule="auto"/>
-              <w:ind w:firstLine="0"/>
-              <w:jc w:val="left"/>
-              <w:rPr/>
-            </w:pPr>
-            <w:r>
-              <w:rPr>
-                <w:rFonts w:ascii="Courier New" w:hAnsi="Courier New"/>
-                <w:sz w:val="20"/>
-              </w:rPr>
-              <w:t xml:space="preserve">            constructor(app) {</w:t>
-            </w:r>
-            <w:r/>
-          </w:p>
-          <w:p>
-            <w:pPr>
-              <w:pBdr/>
-              <w:spacing w:after="0" w:before="0" w:line="240" w:lineRule="auto"/>
-              <w:ind w:firstLine="0"/>
-              <w:jc w:val="left"/>
-              <w:rPr/>
-            </w:pPr>
-            <w:r>
-              <w:rPr>
-                <w:rFonts w:ascii="Courier New" w:hAnsi="Courier New"/>
-                <w:sz w:val="20"/>
-              </w:rPr>
-              <w:t xml:space="preserve">                this.app = app; this.btn = document.getElementById('ar-btn'); this.hitTestSource = null; this.localSpace = null; if (!('xr' in navigator)) return this.btn.disabled = true;</w:t>
-            </w:r>
-            <w:r/>
-          </w:p>
-          <w:p>
-            <w:pPr>
-              <w:pBdr/>
-              <w:spacing w:after="0" w:before="0" w:line="240" w:lineRule="auto"/>
-              <w:ind w:firstLine="0"/>
-              <w:jc w:val="left"/>
-              <w:rPr/>
-            </w:pPr>
-            <w:r>
-              <w:rPr>
-                <w:rFonts w:ascii="Courier New" w:hAnsi="Courier New"/>
-                <w:sz w:val="20"/>
-              </w:rPr>
-              <w:t xml:space="preserve">                navigator.xr.isSessionSupported('immersive-ar').then(s =&gt; this.btn.disabled = !s);</w:t>
-            </w:r>
-            <w:r/>
-          </w:p>
-          <w:p>
-            <w:pPr>
-              <w:pBdr/>
-              <w:spacing w:after="0" w:before="0" w:line="240" w:lineRule="auto"/>
-              <w:ind w:firstLine="0"/>
-              <w:jc w:val="left"/>
-              <w:rPr/>
-            </w:pPr>
-            <w:r>
-              <w:rPr>
-                <w:rFonts w:ascii="Courier New" w:hAnsi="Courier New"/>
-                <w:sz w:val="20"/>
-              </w:rPr>
-              <w:t xml:space="preserve">                this.btn.addEventListener('click', async () =&gt; {</w:t>
-            </w:r>
-            <w:r/>
-          </w:p>
-          <w:p>
-            <w:pPr>
-              <w:pBdr/>
-              <w:spacing w:after="0" w:before="0" w:line="240" w:lineRule="auto"/>
-              <w:ind w:firstLine="0"/>
-              <w:jc w:val="left"/>
-              <w:rPr/>
-            </w:pPr>
-            <w:r>
-              <w:rPr>
-                <w:rFonts w:ascii="Courier New" w:hAnsi="Courier New"/>
-                <w:sz w:val="20"/>
-              </w:rPr>
-              <w:t xml:space="preserve">                    const session = await navigator.xr.requestSession('immersive-ar', { requiredFeatures: ['hit-test'] });</w:t>
-            </w:r>
-            <w:r/>
-          </w:p>
-          <w:p>
-            <w:pPr>
-              <w:pBdr/>
-              <w:spacing w:after="0" w:before="0" w:line="240" w:lineRule="auto"/>
-              <w:ind w:firstLine="0"/>
-              <w:jc w:val="left"/>
-              <w:rPr/>
-            </w:pPr>
-            <w:r>
-              <w:rPr>
-                <w:rFonts w:ascii="Courier New" w:hAnsi="Courier New"/>
-                <w:sz w:val="20"/>
-              </w:rPr>
-              <w:t xml:space="preserve">                    this.app.renderer.xr.setReferenceSpaceType('local-floor'); await this.app.renderer.xr.setSession(session); this.btn.style.display = 'none';</w:t>
-            </w:r>
-            <w:r/>
-          </w:p>
-          <w:p>
-            <w:pPr>
-              <w:pBdr/>
-              <w:spacing w:after="0" w:before="0" w:line="240" w:lineRule="auto"/>
-              <w:ind w:firstLine="0"/>
-              <w:jc w:val="left"/>
-              <w:rPr/>
-            </w:pPr>
-            <w:r>
-              <w:rPr>
-                <w:rFonts w:ascii="Courier New" w:hAnsi="Courier New"/>
-                <w:sz w:val="20"/>
-              </w:rPr>
-              <w:t xml:space="preserve">                    this.hitTestSource = await session.requestHitTestSource({ space: await session.requestReferenceSpace('viewer') }); this.localSpace = await session.requestReferenceSpace('local-floor');</w:t>
-            </w:r>
-            <w:r/>
-          </w:p>
-          <w:p>
-            <w:pPr>
-              <w:pBdr/>
-              <w:spacing w:after="0" w:before="0" w:line="240" w:lineRule="auto"/>
-              <w:ind w:firstLine="0"/>
-              <w:jc w:val="left"/>
-              <w:rPr/>
-            </w:pPr>
-            <w:r>
-              <w:rPr>
-                <w:rFonts w:ascii="Courier New" w:hAnsi="Courier New"/>
-                <w:sz w:val="20"/>
-              </w:rPr>
-              <w:t xml:space="preserve">                    session.addEventListener('end', () =&gt; { this.hitTestSource = null; this.btn.style.display = 'block'; });</w:t>
-            </w:r>
-            <w:r/>
-          </w:p>
-          <w:p>
-            <w:pPr>
-              <w:pBdr/>
-              <w:spacing w:after="0" w:before="0" w:line="240" w:lineRule="auto"/>
-              <w:ind w:firstLine="0"/>
-              <w:jc w:val="left"/>
-              <w:rPr/>
-            </w:pPr>
-            <w:r>
-              <w:rPr>
-                <w:rFonts w:ascii="Courier New" w:hAnsi="Courier New"/>
-                <w:sz w:val="20"/>
-              </w:rPr>
-              <w:t xml:space="preserve">                });</w:t>
-            </w:r>
-            <w:r/>
-          </w:p>
-          <w:p>
-            <w:pPr>
-              <w:pBdr/>
-              <w:spacing w:after="0" w:before="0" w:line="240" w:lineRule="auto"/>
-              <w:ind w:firstLine="0"/>
-              <w:jc w:val="left"/>
-              <w:rPr/>
-            </w:pPr>
-            <w:r>
-              <w:rPr>
-                <w:rFonts w:ascii="Courier New" w:hAnsi="Courier New"/>
-                <w:sz w:val="20"/>
-              </w:rPr>
-              <w:t xml:space="preserve">            }</w:t>
-            </w:r>
-            <w:r/>
-          </w:p>
-          <w:p>
-            <w:pPr>
-              <w:pBdr/>
-              <w:spacing w:after="0" w:before="0" w:line="240" w:lineRule="auto"/>
-              <w:ind w:firstLine="0"/>
-              <w:jc w:val="left"/>
-              <w:rPr/>
-            </w:pPr>
-            <w:r>
-              <w:rPr>
-                <w:rFonts w:ascii="Courier New" w:hAnsi="Courier New"/>
-                <w:sz w:val="20"/>
-              </w:rPr>
-              <w:t xml:space="preserve">            update(frame) { if (frame &amp;&amp; this.hitTestSource &amp;&amp; this.localSpace) { const hits = frame.getHitTestResults(this.hitTestSource); this.app.reticle.visible = hits.length &gt; 0; if (hits.length &gt; 0) this.app.reticle.matrix.fromArray(hits[0].getPose(th</w:t>
-            </w:r>
-            <w:r>
-              <w:rPr>
-                <w:rFonts w:ascii="Courier New" w:hAnsi="Courier New"/>
-                <w:sz w:val="20"/>
-              </w:rPr>
-              <w:t xml:space="preserve">is.localSpace).transform.matrix); } }</w:t>
-            </w:r>
-            <w:r/>
-          </w:p>
-          <w:p>
-            <w:pPr>
-              <w:pBdr/>
-              <w:spacing w:after="0" w:before="0" w:line="240" w:lineRule="auto"/>
-              <w:ind w:firstLine="0"/>
-              <w:jc w:val="left"/>
-              <w:rPr/>
-            </w:pPr>
-            <w:r>
-              <w:rPr>
-                <w:rFonts w:ascii="Courier New" w:hAnsi="Courier New"/>
-                <w:sz w:val="20"/>
-              </w:rPr>
+              <w:br/>
+              <w:t xml:space="preserve">        window.onresize = () =&gt; {</w:t>
+              <w:br/>
+              <w:t xml:space="preserve">            this.camera.aspect = innerWidth / innerHeight;</w:t>
+              <w:br/>
+              <w:t xml:space="preserve">            this.camera.updateProjectionMatrix();</w:t>
+              <w:br/>
+              <w:t xml:space="preserve">            this.renderer.setSize(innerWidth, innerHeight);</w:t>
+              <w:br/>
+              <w:t xml:space="preserve">        };</w:t>
+              <w:br/>
+              <w:t xml:space="preserve">        this.renderer.setAnimationLoop((time, frame) =&gt; this.render(frame));</w:t>
+              <w:br/>
+              <w:t xml:space="preserve">    }</w:t>
+              <w:br/>
+              <w:t xml:space="preserve">    preview() {</w:t>
+              <w:br/>
+              <w:t xml:space="preserve">        if (this.source) this.source.cancel();</w:t>
+              <w:br/>
+              <w:t xml:space="preserve">        this.source = null;</w:t>
+              <w:br/>
+              <w:t xml:space="preserve">        this.session = null;</w:t>
+              <w:br/>
+              <w:t xml:space="preserve">        this.placed = false;</w:t>
+              <w:br/>
+              <w:t xml:space="preserve">        this.reticle.visible = false;</w:t>
+              <w:br/>
+              <w:t xml:space="preserve">        this.model.root.visible = true;</w:t>
+              <w:br/>
+              <w:t xml:space="preserve">        this.model.root.position.set(0, 0, 0);</w:t>
+              <w:br/>
+              <w:t xml:space="preserve">        this.camera.position.set(0.85, 0.65, 1.35);</w:t>
+              <w:br/>
+              <w:t xml:space="preserve">        this.camera.lookAt(0, 0.12, 0);</w:t>
+              <w:br/>
+              <w:t xml:space="preserve">        element('ar').textContent = 'Войти в AR';</w:t>
+              <w:br/>
+              <w:t xml:space="preserve">    }</w:t>
+              <w:br/>
+              <w:t xml:space="preserve">    async toggleAR() {</w:t>
+              <w:br/>
+              <w:t xml:space="preserve">        element('ar').disabled = true;</w:t>
+              <w:br/>
+              <w:t xml:space="preserve">        try {</w:t>
+              <w:br/>
+              <w:t xml:space="preserve">            if (this.session) return await this.session.end();</w:t>
+              <w:br/>
+              <w:t xml:space="preserve">            this.session = await navigator.xr.requestSession('immersive-ar', {</w:t>
+              <w:br/>
+              <w:t xml:space="preserve">                requiredFeatures: ['hit-test', 'local-floor', 'dom-overlay'],</w:t>
+              <w:br/>
+              <w:t xml:space="preserve">                domOverlay: { root: element('overlay') }</w:t>
+              <w:br/>
+              <w:t xml:space="preserve">            });</w:t>
+              <w:br/>
+              <w:t xml:space="preserve">            await this.renderer.xr.setSession(this.session);</w:t>
+              <w:br/>
+              <w:t xml:space="preserve">            const viewer = await this.session.requestReferenceSpace('viewer');</w:t>
+              <w:br/>
+              <w:t xml:space="preserve">            this.source = await this.session.requestHitTestSource({ space: viewer });</w:t>
+              <w:br/>
+              <w:t xml:space="preserve">            this.model.root.visible = false;</w:t>
+              <w:br/>
+              <w:t xml:space="preserve">            element('ar').textContent = 'Выйти из AR';</w:t>
+              <w:br/>
+              <w:t xml:space="preserve">        } catch (error) {</w:t>
+              <w:br/>
+              <w:t xml:space="preserve">            if (this.session) await this.session.end().catch(() =&gt; {});</w:t>
+              <w:br/>
+              <w:t xml:space="preserve">            this.preview();</w:t>
+              <w:br/>
+              <w:t xml:space="preserve">            element('status').textContent = 'Ошибка AR: ' + error.message;</w:t>
+              <w:br/>
+              <w:t xml:space="preserve">        } finally {</w:t>
+              <w:br/>
+              <w:t xml:space="preserve">            element('ar').disabled = false;</w:t>
+              <w:br/>
               <w:t xml:space="preserve">        }</w:t>
-            </w:r>
-            <w:r/>
-          </w:p>
-          <w:p>
-            <w:pPr>
-              <w:pBdr/>
-              <w:spacing w:after="0" w:before="0" w:line="240" w:lineRule="auto"/>
-              <w:ind w:firstLine="0"/>
-              <w:jc w:val="left"/>
-              <w:rPr/>
-            </w:pPr>
-            <w:r>
-              <w:rPr>
-                <w:rFonts w:ascii="Courier New" w:hAnsi="Courier New"/>
-                <w:sz w:val="20"/>
-              </w:rPr>
-              <w:t xml:space="preserve">        class App {</w:t>
-            </w:r>
-            <w:r/>
-          </w:p>
-          <w:p>
-            <w:pPr>
-              <w:pBdr/>
-              <w:spacing w:after="0" w:before="0" w:line="240" w:lineRule="auto"/>
-              <w:ind w:firstLine="0"/>
-              <w:jc w:val="left"/>
-              <w:rPr/>
-            </w:pPr>
-            <w:r>
-              <w:rPr>
-                <w:rFonts w:ascii="Courier New" w:hAnsi="Courier New"/>
-                <w:sz w:val="20"/>
-              </w:rPr>
-              <w:t xml:space="preserve">            constructor() {</w:t>
-            </w:r>
-            <w:r/>
-          </w:p>
-          <w:p>
-            <w:pPr>
-              <w:pBdr/>
-              <w:spacing w:after="0" w:before="0" w:line="240" w:lineRule="auto"/>
-              <w:ind w:firstLine="0"/>
-              <w:jc w:val="left"/>
-              <w:rPr/>
-            </w:pPr>
-            <w:r>
-              <w:rPr>
-                <w:rFonts w:ascii="Courier New" w:hAnsi="Courier New"/>
-                <w:sz w:val="20"/>
-              </w:rPr>
-              <w:t xml:space="preserve">                const params = new URLSearchParams(window.location.search); this.demo = params.get('demo'); this.clock = new THREE.Clock(); this.scene = new THREE.Scene();</w:t>
-            </w:r>
-            <w:r/>
-          </w:p>
-          <w:p>
-            <w:pPr>
-              <w:pBdr/>
-              <w:spacing w:after="0" w:before="0" w:line="240" w:lineRule="auto"/>
-              <w:ind w:firstLine="0"/>
-              <w:jc w:val="left"/>
-              <w:rPr/>
-            </w:pPr>
-            <w:r>
-              <w:rPr>
-                <w:rFonts w:ascii="Courier New" w:hAnsi="Courier New"/>
-                <w:sz w:val="20"/>
-              </w:rPr>
-              <w:t xml:space="preserve">                this.camera = new THREE.PerspectiveCamera(70, window.innerWidth / window.innerHeight, 0.01, 20);</w:t>
-            </w:r>
-            <w:r/>
-          </w:p>
-          <w:p>
-            <w:pPr>
-              <w:pBdr/>
-              <w:spacing w:after="0" w:before="0" w:line="240" w:lineRule="auto"/>
-              <w:ind w:firstLine="0"/>
-              <w:jc w:val="left"/>
-              <w:rPr/>
-            </w:pPr>
-            <w:r>
-              <w:rPr>
-                <w:rFonts w:ascii="Courier New" w:hAnsi="Courier New"/>
-                <w:sz w:val="20"/>
-              </w:rPr>
-              <w:t xml:space="preserve">                this.renderer = new THREE.WebGLRenderer({ antialias: true, alpha: true }); this.renderer.setPixelRatio(window.devicePixelRatio);</w:t>
-            </w:r>
-            <w:r/>
-          </w:p>
-          <w:p>
-            <w:pPr>
-              <w:pBdr/>
-              <w:spacing w:after="0" w:before="0" w:line="240" w:lineRule="auto"/>
-              <w:ind w:firstLine="0"/>
-              <w:jc w:val="left"/>
-              <w:rPr/>
-            </w:pPr>
-            <w:r>
-              <w:rPr>
-                <w:rFonts w:ascii="Courier New" w:hAnsi="Courier New"/>
-                <w:sz w:val="20"/>
-              </w:rPr>
-              <w:t xml:space="preserve">                this.renderer.setSize(window.innerWidth, window.innerHeight); this.renderer.toneMapping = THREE.ACESFilmicToneMapping; this.renderer.xr.enabled = true; document.body.appendChild(this.renderer.domElement);</w:t>
-            </w:r>
-            <w:r/>
-          </w:p>
-          <w:p>
-            <w:pPr>
-              <w:pBdr/>
-              <w:spacing w:after="0" w:before="0" w:line="240" w:lineRule="auto"/>
-              <w:ind w:firstLine="0"/>
-              <w:jc w:val="left"/>
-              <w:rPr/>
-            </w:pPr>
-            <w:r>
-              <w:rPr>
-                <w:rFonts w:ascii="Courier New" w:hAnsi="Courier New"/>
-                <w:sz w:val="20"/>
-              </w:rPr>
-              <w:t xml:space="preserve">                this.envManager = new EnvLightingManager(this.scene, this.renderer); this.modelManager = new ModelManager(this.scene); this.arManager = new ARSessionManager(this);</w:t>
-            </w:r>
-            <w:r/>
-          </w:p>
-          <w:p>
-            <w:pPr>
-              <w:pBdr/>
-              <w:spacing w:after="0" w:before="0" w:line="240" w:lineRule="auto"/>
-              <w:ind w:firstLine="0"/>
-              <w:jc w:val="left"/>
-              <w:rPr/>
-            </w:pPr>
-            <w:r>
-              <w:rPr>
-                <w:rFonts w:ascii="Courier New" w:hAnsi="Courier New"/>
-                <w:sz w:val="20"/>
-              </w:rPr>
-              <w:t xml:space="preserve">                this.reticle = new THREE.Mesh(new THREE.RingGeometry(0.12, 0.15, 32).rotateX(-Math.PI / 2), new THREE.MeshBasicMaterial({ color: 0x60a5fa, side: THREE.DoubleSide }));</w:t>
-            </w:r>
-            <w:r/>
-          </w:p>
-          <w:p>
-            <w:pPr>
-              <w:pBdr/>
-              <w:spacing w:after="0" w:before="0" w:line="240" w:lineRule="auto"/>
-              <w:ind w:firstLine="0"/>
-              <w:jc w:val="left"/>
-              <w:rPr/>
-            </w:pPr>
-            <w:r>
-              <w:rPr>
-                <w:rFonts w:ascii="Courier New" w:hAnsi="Courier New"/>
-                <w:sz w:val="20"/>
-              </w:rPr>
-              <w:t xml:space="preserve">                this.reticle.matrixAutoUpdate = false; this.reticle.visible = false; this.scene.add(this.reticle);</w:t>
-            </w:r>
-            <w:r/>
-          </w:p>
-          <w:p>
-            <w:pPr>
-              <w:pBdr/>
-              <w:spacing w:after="0" w:before="0" w:line="240" w:lineRule="auto"/>
-              <w:ind w:firstLine="0"/>
-              <w:jc w:val="left"/>
-              <w:rPr/>
-            </w:pPr>
-            <w:r>
-              <w:rPr>
-                <w:rFonts w:ascii="Courier New" w:hAnsi="Courier New"/>
-                <w:sz w:val="20"/>
-              </w:rPr>
-              <w:t xml:space="preserve">                this.controller = this.renderer.xr.getController(0);</w:t>
-            </w:r>
-            <w:r/>
-          </w:p>
-          <w:p>
-            <w:pPr>
-              <w:pBdr/>
-              <w:spacing w:after="0" w:before="0" w:line="240" w:lineRule="auto"/>
-              <w:ind w:firstLine="0"/>
-              <w:jc w:val="left"/>
-              <w:rPr/>
-            </w:pPr>
-            <w:r>
-              <w:rPr>
-                <w:rFonts w:ascii="Courier New" w:hAnsi="Courier New"/>
-                <w:sz w:val="20"/>
-              </w:rPr>
-              <w:t xml:space="preserve">                this.controller.addEventListener('select', () =&gt; { if (this.reticle.visible) { const p = new THREE.Vector3(), q = new THREE.Quaternion(), s = new THREE.Vector3(); this.reticle.matrix.decompose(p, q, s); this.modelManager.rootGroup.position.c</w:t>
-            </w:r>
-            <w:r>
-              <w:rPr>
-                <w:rFonts w:ascii="Courier New" w:hAnsi="Courier New"/>
-                <w:sz w:val="20"/>
-              </w:rPr>
-              <w:t xml:space="preserve">opy(p); } });</w:t>
-            </w:r>
-            <w:r/>
-          </w:p>
-          <w:p>
-            <w:pPr>
-              <w:pBdr/>
-              <w:spacing w:after="0" w:before="0" w:line="240" w:lineRule="auto"/>
-              <w:ind w:firstLine="0"/>
-              <w:jc w:val="left"/>
-              <w:rPr/>
-            </w:pPr>
-            <w:r>
-              <w:rPr>
-                <w:rFonts w:ascii="Courier New" w:hAnsi="Courier New"/>
-                <w:sz w:val="20"/>
-              </w:rPr>
-              <w:t xml:space="preserve">                this.scene.add(this.controller); this.setupUI();</w:t>
-            </w:r>
-            <w:r/>
-          </w:p>
-          <w:p>
-            <w:pPr>
-              <w:pBdr/>
-              <w:spacing w:after="0" w:before="0" w:line="240" w:lineRule="auto"/>
-              <w:ind w:firstLine="0"/>
-              <w:jc w:val="left"/>
-              <w:rPr/>
-            </w:pPr>
-            <w:r>
-              <w:rPr>
-                <w:rFonts w:ascii="Courier New" w:hAnsi="Courier New"/>
-                <w:sz w:val="20"/>
-              </w:rPr>
-              <w:t xml:space="preserve">                if (this.demo) {</w:t>
-            </w:r>
-            <w:r/>
-          </w:p>
-          <w:p>
-            <w:pPr>
-              <w:pBdr/>
-              <w:spacing w:after="0" w:before="0" w:line="240" w:lineRule="auto"/>
-              <w:ind w:firstLine="0"/>
-              <w:jc w:val="left"/>
-              <w:rPr/>
-            </w:pPr>
-            <w:r>
-              <w:rPr>
-                <w:rFonts w:ascii="Courier New" w:hAnsi="Courier New"/>
-                <w:sz w:val="20"/>
-              </w:rPr>
-              <w:t xml:space="preserve">                    document.getElementById('ar-btn').style.display = 'none'; this.camera.position.set(0, 0.8, 1.2); this.camera.lookAt(0, 0.1, -0.6);</w:t>
-            </w:r>
-            <w:r/>
-          </w:p>
-          <w:p>
-            <w:pPr>
-              <w:pBdr/>
-              <w:spacing w:after="0" w:before="0" w:line="240" w:lineRule="auto"/>
-              <w:ind w:firstLine="0"/>
-              <w:jc w:val="left"/>
-              <w:rPr/>
-            </w:pPr>
-            <w:r>
-              <w:rPr>
-                <w:rFonts w:ascii="Courier New" w:hAnsi="Courier New"/>
-                <w:sz w:val="20"/>
-              </w:rPr>
-              <w:t xml:space="preserve">                    const grid = new THREE.GridHelper(6, 12, 0x3b82f6, 0x1e293b); grid.position.set(0, 0, -0.6); this.scene.add(grid); this.modelManager.rootGroup.position.set(0, 0, -0.6);</w:t>
-            </w:r>
-            <w:r/>
-          </w:p>
-          <w:p>
-            <w:pPr>
-              <w:pBdr/>
-              <w:spacing w:after="0" w:before="0" w:line="240" w:lineRule="auto"/>
-              <w:ind w:firstLine="0"/>
-              <w:jc w:val="left"/>
-              <w:rPr/>
-            </w:pPr>
-            <w:r>
-              <w:rPr>
-                <w:rFonts w:ascii="Courier New" w:hAnsi="Courier New"/>
-                <w:sz w:val="20"/>
-              </w:rPr>
-              <w:t xml:space="preserve">                    if (this.demo === 'color') { this.modelManager.setColor(0x10b981); this.modelManager.switchModel('torus'); }</w:t>
-            </w:r>
-            <w:r/>
-          </w:p>
-          <w:p>
-            <w:pPr>
-              <w:pBdr/>
-              <w:spacing w:after="0" w:before="0" w:line="240" w:lineRule="auto"/>
-              <w:ind w:firstLine="0"/>
-              <w:jc w:val="left"/>
-              <w:rPr/>
-            </w:pPr>
-            <w:r>
-              <w:rPr>
-                <w:rFonts w:ascii="Courier New" w:hAnsi="Courier New"/>
-                <w:sz w:val="20"/>
-              </w:rPr>
-              <w:t xml:space="preserve">                }</w:t>
-            </w:r>
-            <w:r/>
-          </w:p>
-          <w:p>
-            <w:pPr>
-              <w:pBdr/>
-              <w:spacing w:after="0" w:before="0" w:line="240" w:lineRule="auto"/>
-              <w:ind w:firstLine="0"/>
-              <w:jc w:val="left"/>
-              <w:rPr/>
-            </w:pPr>
-            <w:r>
-              <w:rPr>
-                <w:rFonts w:ascii="Courier New" w:hAnsi="Courier New"/>
-                <w:sz w:val="20"/>
-              </w:rPr>
-              <w:t xml:space="preserve">                window.addEventListener('resize', () =&gt; { this.camera.aspect = window.innerWidth / window.innerHeight; this.camera.updateProjectionMatrix(); this.renderer.setSize(window.innerWidth, window.innerHeight); });</w:t>
-            </w:r>
-            <w:r/>
-          </w:p>
-          <w:p>
-            <w:pPr>
-              <w:pBdr/>
-              <w:spacing w:after="0" w:before="0" w:line="240" w:lineRule="auto"/>
-              <w:ind w:firstLine="0"/>
-              <w:jc w:val="left"/>
-              <w:rPr/>
-            </w:pPr>
-            <w:r>
-              <w:rPr>
-                <w:rFonts w:ascii="Courier New" w:hAnsi="Courier New"/>
-                <w:sz w:val="20"/>
-              </w:rPr>
-              <w:t xml:space="preserve">                this.renderer.setAnimationLoop((t, f) =&gt; { this.modelManager.update(this.clock.getDelta()); this.arManager.update(f); this.renderer.render(this.scene, this.camera); });</w:t>
-            </w:r>
-            <w:r/>
-          </w:p>
-          <w:p>
-            <w:pPr>
-              <w:pBdr/>
-              <w:spacing w:after="0" w:before="0" w:line="240" w:lineRule="auto"/>
-              <w:ind w:firstLine="0"/>
-              <w:jc w:val="left"/>
-              <w:rPr/>
-            </w:pPr>
-            <w:r>
-              <w:rPr>
-                <w:rFonts w:ascii="Courier New" w:hAnsi="Courier New"/>
-                <w:sz w:val="20"/>
-              </w:rPr>
-              <w:t xml:space="preserve">            }</w:t>
-            </w:r>
-            <w:r/>
-          </w:p>
-          <w:p>
-            <w:pPr>
-              <w:pBdr/>
-              <w:spacing w:after="0" w:before="0" w:line="240" w:lineRule="auto"/>
-              <w:ind w:firstLine="0"/>
-              <w:jc w:val="left"/>
-              <w:rPr/>
-            </w:pPr>
-            <w:r>
-              <w:rPr>
-                <w:rFonts w:ascii="Courier New" w:hAnsi="Courier New"/>
-                <w:sz w:val="20"/>
-              </w:rPr>
-              <w:t xml:space="preserve">            setupUI() {</w:t>
-            </w:r>
-            <w:r/>
-          </w:p>
-          <w:p>
-            <w:pPr>
-              <w:pBdr/>
-              <w:spacing w:after="0" w:before="0" w:line="240" w:lineRule="auto"/>
-              <w:ind w:firstLine="0"/>
-              <w:jc w:val="left"/>
-              <w:rPr/>
-            </w:pPr>
-            <w:r>
-              <w:rPr>
-                <w:rFonts w:ascii="Courier New" w:hAnsi="Courier New"/>
-                <w:sz w:val="20"/>
-              </w:rPr>
-              <w:t xml:space="preserve">                const rotBtn = document.getElementById('btn-rotate');</w:t>
-            </w:r>
-            <w:r/>
-          </w:p>
-          <w:p>
-            <w:pPr>
-              <w:pBdr/>
-              <w:spacing w:after="0" w:before="0" w:line="240" w:lineRule="auto"/>
-              <w:ind w:firstLine="0"/>
-              <w:jc w:val="left"/>
-              <w:rPr/>
-            </w:pPr>
-            <w:r>
-              <w:rPr>
-                <w:rFonts w:ascii="Courier New" w:hAnsi="Courier New"/>
-                <w:sz w:val="20"/>
-              </w:rPr>
-              <w:t xml:space="preserve">                rotBtn.addEventListener('click', () =&gt; { this.modelManager.isRotating = !this.modelManager.isRotating; rotBtn.textContent = `Вращение: ${this.modelManager.isRotating ? 'Вкл' : 'Выкл'}`; rotBtn.classList.toggle('active', this.modelManager.isR</w:t>
-            </w:r>
-            <w:r>
-              <w:rPr>
-                <w:rFonts w:ascii="Courier New" w:hAnsi="Courier New"/>
-                <w:sz w:val="20"/>
-              </w:rPr>
-              <w:t xml:space="preserve">otating); });</w:t>
-            </w:r>
-            <w:r/>
-          </w:p>
-          <w:p>
-            <w:pPr>
-              <w:pBdr/>
-              <w:spacing w:after="0" w:before="0" w:line="240" w:lineRule="auto"/>
-              <w:ind w:firstLine="0"/>
-              <w:jc w:val="left"/>
-              <w:rPr/>
-            </w:pPr>
-            <w:r>
-              <w:rPr>
-                <w:rFonts w:ascii="Courier New" w:hAnsi="Courier New"/>
-                <w:sz w:val="20"/>
-              </w:rPr>
-              <w:t xml:space="preserve">                document.querySelectorAll('.model-btns button, .ui-row button').forEach(btn =&gt; {</w:t>
-            </w:r>
-            <w:r/>
-          </w:p>
-          <w:p>
-            <w:pPr>
-              <w:pBdr/>
-              <w:spacing w:after="0" w:before="0" w:line="240" w:lineRule="auto"/>
-              <w:ind w:firstLine="0"/>
-              <w:jc w:val="left"/>
-              <w:rPr/>
-            </w:pPr>
-            <w:r>
-              <w:rPr>
-                <w:rFonts w:ascii="Courier New" w:hAnsi="Courier New"/>
-                <w:sz w:val="20"/>
-              </w:rPr>
-              <w:t xml:space="preserve">                    btn.addEventListener('click', (e) =&gt; { const p = e.target.parentElement; if (p.children.length &gt; 1) { Array.from(p.children).forEach(b =&gt; b.classList.remove('active')); e.target.classList.add('active'); } });</w:t>
-            </w:r>
-            <w:r/>
-          </w:p>
-          <w:p>
-            <w:pPr>
-              <w:pBdr/>
-              <w:spacing w:after="0" w:before="0" w:line="240" w:lineRule="auto"/>
-              <w:ind w:firstLine="0"/>
-              <w:jc w:val="left"/>
-              <w:rPr/>
-            </w:pPr>
-            <w:r>
-              <w:rPr>
-                <w:rFonts w:ascii="Courier New" w:hAnsi="Courier New"/>
-                <w:sz w:val="20"/>
-              </w:rPr>
-              <w:t xml:space="preserve">                });</w:t>
-            </w:r>
-            <w:r/>
-          </w:p>
-          <w:p>
-            <w:pPr>
-              <w:pBdr/>
-              <w:spacing w:after="0" w:before="0" w:line="240" w:lineRule="auto"/>
-              <w:ind w:firstLine="0"/>
-              <w:jc w:val="left"/>
-              <w:rPr/>
-            </w:pPr>
-            <w:r>
-              <w:rPr>
-                <w:rFonts w:ascii="Courier New" w:hAnsi="Courier New"/>
-                <w:sz w:val="20"/>
-              </w:rPr>
-              <w:t xml:space="preserve">            }</w:t>
-            </w:r>
-            <w:r/>
-          </w:p>
-          <w:p>
-            <w:pPr>
-              <w:pBdr/>
-              <w:spacing w:after="0" w:before="0" w:line="240" w:lineRule="auto"/>
-              <w:ind w:firstLine="0"/>
-              <w:jc w:val="left"/>
-              <w:rPr/>
-            </w:pPr>
-            <w:r>
-              <w:rPr>
-                <w:rFonts w:ascii="Courier New" w:hAnsi="Courier New"/>
-                <w:sz w:val="20"/>
-              </w:rPr>
+              <w:br/>
+              <w:t xml:space="preserve">    }</w:t>
+              <w:br/>
+              <w:t xml:space="preserve">    place() {</w:t>
+              <w:br/>
+              <w:t xml:space="preserve">        if (!this.session || this.placed || !this.reticle.visible) return;</w:t>
+              <w:br/>
+              <w:t xml:space="preserve">        this.model.root.position.setFromMatrixPosition(this.reticle.matrix);</w:t>
+              <w:br/>
+              <w:t xml:space="preserve">        this.model.root.visible = this.placed = true;</w:t>
+              <w:br/>
+              <w:t xml:space="preserve">        this.reticle.visible = false;</w:t>
+              <w:br/>
+              <w:t xml:space="preserve">    }</w:t>
+              <w:br/>
+              <w:t xml:space="preserve">    render(frame) {</w:t>
+              <w:br/>
+              <w:t xml:space="preserve">        if (frame &amp;&amp; this.source &amp;&amp; !this.placed) {</w:t>
+              <w:br/>
+              <w:t xml:space="preserve">            const hits = frame.getHitTestResults(this.source);</w:t>
+              <w:br/>
+              <w:t xml:space="preserve">            const pose = hits.length ? hits[0].getPose(this.renderer.xr.getReferenceSpace()) : null;</w:t>
+              <w:br/>
+              <w:t xml:space="preserve">            this.reticle.visible = Boolean(pose);</w:t>
+              <w:br/>
+              <w:t xml:space="preserve">            if (pose) this.reticle.matrix.fromArray(pose.transform.matrix);</w:t>
+              <w:br/>
               <w:t xml:space="preserve">        }</w:t>
-            </w:r>
-            <w:r/>
-          </w:p>
-          <w:p>
-            <w:pPr>
-              <w:pBdr/>
-              <w:spacing w:after="0" w:before="0" w:line="240" w:lineRule="auto"/>
-              <w:ind w:firstLine="0"/>
-              <w:jc w:val="left"/>
-              <w:rPr/>
-            </w:pPr>
-            <w:r>
-              <w:rPr>
-                <w:rFonts w:ascii="Courier New" w:hAnsi="Courier New"/>
-                <w:sz w:val="20"/>
-              </w:rPr>
-              <w:t xml:space="preserve">        const app = new App();</w:t>
-            </w:r>
-            <w:r/>
-          </w:p>
-          <w:p>
-            <w:pPr>
-              <w:pBdr/>
-              <w:spacing w:after="0" w:before="0" w:line="240" w:lineRule="auto"/>
-              <w:ind w:firstLine="0"/>
-              <w:jc w:val="left"/>
-              <w:rPr/>
-            </w:pPr>
-            <w:r>
-              <w:rPr>
-                <w:rFonts w:ascii="Courier New" w:hAnsi="Courier New"/>
-                <w:sz w:val="20"/>
-              </w:rPr>
-              <w:t xml:space="preserve">    &lt;/script&gt;</w:t>
-            </w:r>
-            <w:r/>
-          </w:p>
-          <w:p>
-            <w:pPr>
-              <w:pBdr/>
-              <w:spacing w:after="0" w:before="0" w:line="240" w:lineRule="auto"/>
-              <w:ind w:firstLine="0"/>
-              <w:jc w:val="left"/>
-              <w:rPr/>
-            </w:pPr>
-            <w:r>
-              <w:rPr>
-                <w:rFonts w:ascii="Courier New" w:hAnsi="Courier New"/>
-                <w:sz w:val="20"/>
-              </w:rPr>
-              <w:t xml:space="preserve">&lt;/body&gt;</w:t>
-            </w:r>
-            <w:r/>
-          </w:p>
-          <w:p>
-            <w:pPr>
-              <w:pBdr/>
-              <w:spacing w:after="0" w:before="0" w:line="240" w:lineRule="auto"/>
-              <w:ind w:firstLine="0"/>
-              <w:jc w:val="left"/>
-              <w:rPr>
-                <w:rFonts w:ascii="Courier New" w:hAnsi="Courier New"/>
-                <w:sz w:val="20"/>
-                <w:szCs w:val="20"/>
-                <w:highlight w:val="none"/>
-              </w:rPr>
-            </w:pPr>
-            <w:r>
-              <w:rPr>
-                <w:rFonts w:ascii="Courier New" w:hAnsi="Courier New"/>
-                <w:sz w:val="20"/>
-              </w:rPr>
-              <w:t xml:space="preserve">&lt;/html&gt;</w:t>
-            </w:r>
-            <w:r/>
-            <w:r>
-              <w:rPr>
-                <w:rFonts w:ascii="Courier New" w:hAnsi="Courier New"/>
-                <w:sz w:val="20"/>
-              </w:rPr>
-            </w:r>
-            <w:r>
-              <w:rPr>
-                <w:rFonts w:ascii="Courier New" w:hAnsi="Courier New"/>
-                <w:sz w:val="20"/>
-                <w:szCs w:val="20"/>
-                <w:highlight w:val="none"/>
-              </w:rPr>
-            </w:r>
-          </w:p>
-          <w:p>
-            <w:pPr>
-              <w:keepNext w:val="true"/>
-              <w:pBdr/>
-              <w:spacing w:after="40" w:before="40" w:line="276" w:lineRule="auto"/>
-              <w:ind w:firstLine="0"/>
-              <w:jc w:val="left"/>
-              <w:rPr>
-                <w:highlight w:val="none"/>
-              </w:rPr>
-            </w:pPr>
-            <w:r>
-              <w:rPr>
-                <w:highlight w:val="none"/>
-              </w:rPr>
-            </w:r>
-            <w:r>
-              <w:rPr>
-                <w:highlight w:val="none"/>
-              </w:rPr>
+              <w:br/>
+              <w:t xml:space="preserve">        this.renderer.render(this.scene, this.camera);</w:t>
+              <w:br/>
+              <w:t xml:space="preserve">    }</w:t>
+              <w:br/>
+              <w:t>}</w:t>
+              <w:br/>
+              <w:br/>
+              <w:t>try { new ARApp(); }</w:t>
+              <w:br/>
+              <w:t>catch (error) { element('status').textContent = 'Ошибка сцены: ' + error.message; }</w:t>
+              <w:br/>
+              <w:t>&lt;/script&gt;</w:t>
+              <w:br/>
+              <w:t>&lt;/body&gt;</w:t>
+              <w:br/>
+              <w:t>&lt;/html&gt;</w:t>
             </w:r>
           </w:p>
         </w:tc>
@@ -3901,12 +2712,8 @@
         <w:rPr/>
       </w:pPr>
       <w:r>
-        <w:t xml:space="preserve">Интерфейс пользователя скомпонован в виде полупрозрачного блока ui-overlay с размытием заднего плана (backdrop-filter: blur) и явным указанием pointer-events: auto, исключающим к</w:t>
+        <w:t>Интерфейс использует стандартное оформление браузера. Кнопки поворачивают модель на 15° влево или вправо, поле цвета изменяет material.color, а селектор заменяет геометрию. Положение и поворот группы root при замене сохраняются. CSS задаёт только размещение панели поверх холста и обработку указателя. Для работы панели в AR запрашивается DOM overlay; отмена события beforexrselect предотвращает размещение объекта при нажатии на элементы управления. Без AR модель доступна в режиме просмотра.</w:t>
       </w:r>
-      <w:r>
-        <w:t xml:space="preserve">онфликт экранных жестов с WebXR-холстом. При тапе по кнопкам интерфейса и палитре оттенков цвет материала моментально транслируется через метод material.color.setHex(), а переключение моделей сохраняет текущую матрицу пространственного положения rootGroup.</w:t>
-      </w:r>
-      <w:r/>
     </w:p>
     <w:p>
       <w:pPr>
@@ -3949,215 +2756,135 @@
         <w:rPr/>
       </w:pPr>
       <w:r>
-        <w:t xml:space="preserve">Тестирование разработанного WebAR-приложения проводилось в защищенном HTTPS/localhost-контексте веб-браузера на мобильном устройстве и в среде программной симуляц</w:t>
+        <w:t>Проверены синтаксис JavaScript и работа интерфейса в Chromium с программным рендерингом SwiftShader при размерах окна 390×844, 1280×720 и 844×390. Проверки подтвердили поворот, смену цвета и модели, отображение карты окружения и отсутствие ошибок браузера. На рисунке 1 показан исходный куб в режиме просмотра. На рисунке 2 показан зелёный торический узел после поворота на 45°.</w:t>
       </w:r>
+    </w:p>
+    <w:p>
+      <w:pPr>
+        <w:keepNext/>
+        <w:pBdr/>
+        <w:spacing w:after="0" w:before="0" w:line="269" w:lineRule="auto"/>
+        <w:ind w:firstLine="0"/>
+        <w:jc w:val="center"/>
+        <w:rPr/>
+      </w:pPr>
       <w:r>
-        <w:t xml:space="preserve">ии SwiftShader. Проверены корректность отображения адаптивного интерфейса поверх WebGL-холста, стабильность PBR-бликов при вращении объекта и реакция на изменение геометрических примитивов и оттенков. Результаты тестирования представлены на рисунках 1 и 2.</w:t>
+        <w:drawing>
+          <wp:inline xmlns:pic="http://schemas.openxmlformats.org/drawingml/2006/picture">
+            <wp:extent cx="5040000" cy="3780000"/>
+            <wp:docPr id="5" name="Picture 5"/>
+            <wp:cNvGraphicFramePr>
+              <a:graphicFrameLocks noChangeAspect="1"/>
+            </wp:cNvGraphicFramePr>
+            <a:graphic>
+              <a:graphicData uri="http://schemas.openxmlformats.org/drawingml/2006/picture">
+                <pic:pic>
+                  <pic:nvPicPr>
+                    <pic:cNvPr id="0" name="image.png"/>
+                    <pic:cNvPicPr/>
+                  </pic:nvPicPr>
+                  <pic:blipFill>
+                    <a:blip r:embed="rId14"/>
+                    <a:stretch>
+                      <a:fillRect/>
+                    </a:stretch>
+                  </pic:blipFill>
+                  <pic:spPr>
+                    <a:xfrm>
+                      <a:off x="0" y="0"/>
+                      <a:ext cx="5040000" cy="3780000"/>
+                    </a:xfrm>
+                    <a:prstGeom prst="rect"/>
+                  </pic:spPr>
+                </pic:pic>
+              </a:graphicData>
+            </a:graphic>
+          </wp:inline>
+        </w:drawing>
+      </w:r>
+    </w:p>
+    <w:p>
+      <w:pPr>
+        <w:pBdr/>
+        <w:spacing w:after="20" w:before="0" w:line="269" w:lineRule="auto"/>
+        <w:ind w:firstLine="0"/>
+        <w:jc w:val="center"/>
+        <w:rPr/>
+      </w:pPr>
+      <w:r>
+        <w:t>Рисунок 1 – Куб в режиме просмотра со стандартными элементами управления</w:t>
       </w:r>
       <w:r/>
     </w:p>
     <w:p>
       <w:pPr>
-        <w:keepNext w:val="true"/>
-        <w:pBdr/>
-        <w:spacing w:after="40" w:before="40" w:line="269" w:lineRule="auto"/>
+        <w:keepNext/>
+        <w:pageBreakBefore w:val="false"/>
+        <w:pBdr/>
+        <w:spacing w:after="0" w:before="0" w:line="269" w:lineRule="auto"/>
         <w:ind w:firstLine="0"/>
         <w:jc w:val="center"/>
         <w:rPr/>
       </w:pPr>
       <w:r>
-        <mc:AlternateContent>
-          <mc:Choice Requires="wpg">
-            <w:drawing>
-              <wp:inline xmlns:wp="http://schemas.openxmlformats.org/drawingml/2006/wordprocessingDrawing" distT="0" distB="0" distL="0" distR="0">
-                <wp:extent cx="449147" cy="972000"/>
-                <wp:effectExtent l="0" t="0" r="0" b="0"/>
-                <wp:docPr id="3" name="Picture 298370860"/>
-                <wp:cNvGraphicFramePr>
-                  <a:graphicFrameLocks xmlns:a="http://schemas.openxmlformats.org/drawingml/2006/main" noChangeAspect="1"/>
-                </wp:cNvGraphicFramePr>
-                <a:graphic xmlns:a="http://schemas.openxmlformats.org/drawingml/2006/main">
-                  <a:graphicData uri="http://schemas.openxmlformats.org/drawingml/2006/picture">
-                    <pic:pic xmlns:pic="http://schemas.openxmlformats.org/drawingml/2006/picture">
-                      <pic:nvPicPr>
-                        <pic:cNvPr id="0" name="screen1.png"/>
-                        <pic:cNvPicPr>
-                          <a:picLocks noChangeAspect="1"/>
-                        </pic:cNvPicPr>
-                        <pic:nvPr/>
-                      </pic:nvPicPr>
-                      <pic:blipFill rotWithShape="1">
-                        <a:blip r:embed="rId14"/>
-                        <a:stretch/>
-                      </pic:blipFill>
-                      <pic:spPr bwMode="auto">
-                        <a:xfrm>
-                          <a:off x="0" y="0"/>
-                          <a:ext cx="449147" cy="972000"/>
-                        </a:xfrm>
-                        <a:prstGeom prst="rect">
-                          <a:avLst/>
-                        </a:prstGeom>
-                      </pic:spPr>
-                    </pic:pic>
-                  </a:graphicData>
-                </a:graphic>
-              </wp:inline>
-            </w:drawing>
-          </mc:Choice>
-          <mc:Fallback>
-            <w:pict>
-              <v:shapetype id="_x0000_t75" coordsize="21600,21600" o:spt="75" o:preferrelative="t" path="m@4@5l@4@11@9@11@9@5xe" filled="f" stroked="f">
-                <v:stroke joinstyle="miter"/>
-                <v:formulas>
-                  <v:f eqn="if lineDrawn pixelLineWidth 0"/>
-                  <v:f eqn="sum @0 1 0"/>
-                  <v:f eqn="sum 0 0 @1"/>
-                  <v:f eqn="prod @2 1 2"/>
-                  <v:f eqn="prod @3 21600 pixelWidth"/>
-                  <v:f eqn="prod @3 21600 pixelHeight"/>
-                  <v:f eqn="sum @0 0 1"/>
-                  <v:f eqn="prod @6 1 2"/>
-                  <v:f eqn="prod @7 21600 pixelWidth"/>
-                  <v:f eqn="sum @8 21600 0"/>
-                  <v:f eqn="prod @7 21600 pixelHeight"/>
-                  <v:f eqn="sum @10 21600 0"/>
-                </v:formulas>
-                <v:path o:extrusionok="f" gradientshapeok="t" o:connecttype="rect"/>
-                <o:lock v:ext="edit" aspectratio="t"/>
-              </v:shapetype>
-              <v:shape id="_x0000_i2" o:spid="_x0000_s2" type="#_x0000_t75" style="width:35.37pt;height:76.54pt;mso-wrap-distance-left:0.00pt;mso-wrap-distance-top:0.00pt;mso-wrap-distance-right:0.00pt;mso-wrap-distance-bottom:0.00pt;z-index:1;" stroked="false">
-                <v:imagedata r:id="rId14" o:title=""/>
-                <o:lock v:ext="edit" rotation="t"/>
-              </v:shape>
-            </w:pict>
-          </mc:Fallback>
-        </mc:AlternateContent>
+        <w:drawing>
+          <wp:inline xmlns:pic="http://schemas.openxmlformats.org/drawingml/2006/picture">
+            <wp:extent cx="5040000" cy="3780000"/>
+            <wp:docPr id="6" name="Picture 6"/>
+            <wp:cNvGraphicFramePr>
+              <a:graphicFrameLocks noChangeAspect="1"/>
+            </wp:cNvGraphicFramePr>
+            <a:graphic>
+              <a:graphicData uri="http://schemas.openxmlformats.org/drawingml/2006/picture">
+                <pic:pic>
+                  <pic:nvPicPr>
+                    <pic:cNvPr id="0" name="image.png"/>
+                    <pic:cNvPicPr/>
+                  </pic:nvPicPr>
+                  <pic:blipFill>
+                    <a:blip r:embed="rId15"/>
+                    <a:stretch>
+                      <a:fillRect/>
+                    </a:stretch>
+                  </pic:blipFill>
+                  <pic:spPr>
+                    <a:xfrm>
+                      <a:off x="0" y="0"/>
+                      <a:ext cx="5040000" cy="3780000"/>
+                    </a:xfrm>
+                    <a:prstGeom prst="rect"/>
+                  </pic:spPr>
+                </pic:pic>
+              </a:graphicData>
+            </a:graphic>
+          </wp:inline>
+        </w:drawing>
+      </w:r>
+    </w:p>
+    <w:p>
+      <w:pPr>
+        <w:pBdr/>
+        <w:spacing w:after="20" w:before="0" w:line="269" w:lineRule="auto"/>
+        <w:ind w:firstLine="0"/>
+        <w:jc w:val="center"/>
+        <w:rPr/>
+      </w:pPr>
+      <w:r>
+        <w:t>Рисунок 2 – Замена модели, смена цвета и поворот торического узла на 45°</w:t>
       </w:r>
       <w:r/>
     </w:p>
     <w:p>
       <w:pPr>
         <w:pBdr/>
-        <w:spacing w:after="20" w:before="0" w:line="269" w:lineRule="auto"/>
-        <w:ind w:firstLine="0"/>
-        <w:jc w:val="center"/>
-        <w:rPr/>
-      </w:pPr>
-      <w:r>
-        <w:t xml:space="preserve">Рисунок 1 – Исходное состояние AR-сцены с PBR-освещением и интерфейсом управления</w:t>
-      </w:r>
-      <w:r/>
-    </w:p>
-    <w:p>
-      <w:pPr>
-        <w:keepNext w:val="true"/>
-        <w:pageBreakBefore w:val="false"/>
-        <w:pBdr/>
-        <w:spacing w:after="40" w:before="40" w:line="269" w:lineRule="auto"/>
-        <w:ind w:firstLine="0"/>
-        <w:jc w:val="center"/>
-        <w:rPr/>
-      </w:pPr>
-      <w:r>
-        <mc:AlternateContent>
-          <mc:Choice Requires="wpg">
-            <w:drawing>
-              <wp:inline xmlns:wp="http://schemas.openxmlformats.org/drawingml/2006/wordprocessingDrawing" distT="0" distB="0" distL="0" distR="0">
-                <wp:extent cx="449147" cy="972000"/>
-                <wp:effectExtent l="0" t="0" r="0" b="0"/>
-                <wp:docPr id="4" name="Picture 298370861"/>
-                <wp:cNvGraphicFramePr>
-                  <a:graphicFrameLocks xmlns:a="http://schemas.openxmlformats.org/drawingml/2006/main" noChangeAspect="1"/>
-                </wp:cNvGraphicFramePr>
-                <a:graphic xmlns:a="http://schemas.openxmlformats.org/drawingml/2006/main">
-                  <a:graphicData uri="http://schemas.openxmlformats.org/drawingml/2006/picture">
-                    <pic:pic xmlns:pic="http://schemas.openxmlformats.org/drawingml/2006/picture">
-                      <pic:nvPicPr>
-                        <pic:cNvPr id="0" name="screen2.png"/>
-                        <pic:cNvPicPr>
-                          <a:picLocks noChangeAspect="1"/>
-                        </pic:cNvPicPr>
-                        <pic:nvPr/>
-                      </pic:nvPicPr>
-                      <pic:blipFill rotWithShape="1">
-                        <a:blip r:embed="rId15"/>
-                        <a:stretch/>
-                      </pic:blipFill>
-                      <pic:spPr bwMode="auto">
-                        <a:xfrm>
-                          <a:off x="0" y="0"/>
-                          <a:ext cx="449147" cy="972000"/>
-                        </a:xfrm>
-                        <a:prstGeom prst="rect">
-                          <a:avLst/>
-                        </a:prstGeom>
-                      </pic:spPr>
-                    </pic:pic>
-                  </a:graphicData>
-                </a:graphic>
-              </wp:inline>
-            </w:drawing>
-          </mc:Choice>
-          <mc:Fallback>
-            <w:pict>
-              <v:shapetype id="_x0000_t75" coordsize="21600,21600" o:spt="75" o:preferrelative="t" path="m@4@5l@4@11@9@11@9@5xe" filled="f" stroked="f">
-                <v:stroke joinstyle="miter"/>
-                <v:formulas>
-                  <v:f eqn="if lineDrawn pixelLineWidth 0"/>
-                  <v:f eqn="sum @0 1 0"/>
-                  <v:f eqn="sum 0 0 @1"/>
-                  <v:f eqn="prod @2 1 2"/>
-                  <v:f eqn="prod @3 21600 pixelWidth"/>
-                  <v:f eqn="prod @3 21600 pixelHeight"/>
-                  <v:f eqn="sum @0 0 1"/>
-                  <v:f eqn="prod @6 1 2"/>
-                  <v:f eqn="prod @7 21600 pixelWidth"/>
-                  <v:f eqn="sum @8 21600 0"/>
-                  <v:f eqn="prod @7 21600 pixelHeight"/>
-                  <v:f eqn="sum @10 21600 0"/>
-                </v:formulas>
-                <v:path o:extrusionok="f" gradientshapeok="t" o:connecttype="rect"/>
-                <o:lock v:ext="edit" aspectratio="t"/>
-              </v:shapetype>
-              <v:shape id="_x0000_i3" o:spid="_x0000_s3" type="#_x0000_t75" style="width:35.37pt;height:76.54pt;mso-wrap-distance-left:0.00pt;mso-wrap-distance-top:0.00pt;mso-wrap-distance-right:0.00pt;mso-wrap-distance-bottom:0.00pt;z-index:1;" stroked="false">
-                <v:imagedata r:id="rId15" o:title=""/>
-                <o:lock v:ext="edit" rotation="t"/>
-              </v:shape>
-            </w:pict>
-          </mc:Fallback>
-        </mc:AlternateContent>
-      </w:r>
-      <w:r/>
-    </w:p>
-    <w:p>
-      <w:pPr>
-        <w:pBdr/>
-        <w:spacing w:after="20" w:before="0" w:line="269" w:lineRule="auto"/>
-        <w:ind w:firstLine="0"/>
-        <w:jc w:val="center"/>
-        <w:rPr/>
-      </w:pPr>
-      <w:r>
-        <w:t xml:space="preserve">Рисунок 2 – Интерактивная смена геометрии (тор), переключение PBR-цвета и вращение</w:t>
-      </w:r>
-      <w:r/>
-    </w:p>
-    <w:p>
-      <w:pPr>
-        <w:pBdr/>
         <w:spacing w:after="0" w:before="0" w:line="269" w:lineRule="auto"/>
         <w:ind w:firstLine="709"/>
         <w:jc w:val="both"/>
         <w:rPr/>
       </w:pPr>
       <w:r>
-        <w:t xml:space="preserve">Проведенные инструментальные испытания подтвердил</w:t>
+        <w:t>На искусственных hit-test данных проверены размещение объекта по найденной точке и сохранение его координат при повороте, смене цвета и модели. При отсутствии найденной поверхности объект не размещается. Работа камеры, обнаружение реальных поверхностей и устойчивость пространственной привязки требуют проверки на устройстве с WebXR. Производительность в FPS не измерялась.</w:t>
       </w:r>
-      <w:r>
-        <w:t xml:space="preserve">и, что пользовательский интерфейс плавно обрабатывает события касания без задержек и не вызывает падения частоты кадров ниже 60 FPS. PBR-материалы корректно отражают рассеянный свет окружения, а геометрия стабильно трансформируется без деформации нормалей.</w:t>
-      </w:r>
-      <w:r/>
     </w:p>
     <w:p>
       <w:pPr>
@@ -4200,12 +2927,8 @@
         <w:rPr/>
       </w:pPr>
       <w:r>
-        <w:t xml:space="preserve">В ходе практической работы №5 расширена функциональность WebAR-сцены на Three.js: реализована модульная архитектура на классах ES6, интегрирован сенсорный интерфейс HTML</w:t>
+        <w:t>В ходе практической работы №5 реализовано управление объектом: поворот кнопками, выбор цвета и замена куба на торический узел. Добавлены PBR-материал и карта окружения, а код разделён на классы в одном HTML-файле. Сохранены hit-test и размещение объекта из предыдущей практики. Браузерные проверки подтвердили работу интерфейса; логика размещения проверена на искусственных данных.</w:t>
       </w:r>
-      <w:r>
-        <w:t xml:space="preserve">5 UI с поддержкой переключения моделей и палитры цветов, а также сконфигурировано реалистичное PBR-освещение с генератором карт окружения PMREM. Тестирование подтвердило высокую производительность и корректность обработки взаимодействия в реальном времени.</w:t>
-      </w:r>
-      <w:r/>
     </w:p>
     <w:sectPr>
       <w:headerReference w:type="default" r:id="rId9"/>

</xml_diff>

<commit_message>
Restore white controls background and update report
</commit_message>
<xml_diff>
--- a/docs/ЛиньковМВ_ПР5_РКПДР.docx
+++ b/docs/ЛиньковМВ_ПР5_РКПДР.docx
@@ -2331,7 +2331,7 @@
         <w:rPr/>
       </w:pPr>
       <w:r>
-        <w:t>Приложение реализовано в одном файле index.html на Three.js r128 и WebXR. Класс Lighting создаёт карту окружения через PMREMGenerator и назначает её scene.environment. Класс Model создаёт куб или торический узел с материалом MeshStandardMaterial (roughness = 0.25, metalness = 0.65). Класс Controls обрабатывает элементы управления, а ARApp управляет сессией immersive-ar, системой координат local-floor, hit-test и размещением объекта. Полный код приведён в листинге 1.</w:t>
+        <w:t>Приложение реализовано в одном файле index.html на Three.js r128 и WebXR. Класс Lighting создаёт карту окружения через PMREMGenerator и назначает её scene.environment. Класс Model создаёт куб или четырёхугольную пирамиду с материалом MeshStandardMaterial (roughness = 0.25, metalness = 0.65). Пирамида задаётся через ConeGeometry с четырьмя сегментами основания; flatShading обеспечивает плоские грани. Класс Controls обрабатывает элементы управления, а ARApp управляет сессией immersive-ar, системой координат local-floor, hit-test и размещением объекта. Полный код приведён в листинге 1.</w:t>
       </w:r>
     </w:p>
     <w:p>
@@ -2402,7 +2402,7 @@
               <w:br/>
               <w:t>#overlay { position: fixed; inset: 0; pointer-events: none; }</w:t>
               <w:br/>
-              <w:t>#controls { position: absolute; top: 8px; left: 8px; right: 8px; pointer-events: auto; background: white; }</w:t>
+              <w:t>#controls { position: absolute; bottom: 8px; left: 8px; right: 8px; background: #fff; pointer-events: auto; }</w:t>
               <w:br/>
               <w:t>&lt;/style&gt;</w:t>
               <w:br/>
@@ -2424,9 +2424,7 @@
               <w:br/>
               <w:t xml:space="preserve">        &lt;label&gt;Цвет &lt;input id="color" type="color" value="#3b82f6"&gt;&lt;/label&gt;</w:t>
               <w:br/>
-              <w:t xml:space="preserve">        &lt;label&gt;Модель &lt;select id="model"&gt;&lt;option value="box"&gt;Куб&lt;/option&gt;&lt;option value="knot"&gt;Узел&lt;/option&gt;&lt;/select&gt;&lt;/label&gt;</w:t>
-              <w:br/>
-              <w:t xml:space="preserve">        &lt;p id="status" role="status"&gt;Просмотр модели. Для AR наведите камеру на поверхность и коснитесь зелёного кольца.&lt;/p&gt;</w:t>
+              <w:t xml:space="preserve">        &lt;label&gt;Модель &lt;select id="model"&gt;&lt;option value="box"&gt;Куб&lt;/option&gt;&lt;option value="pyramid"&gt;Пирамида&lt;/option&gt;&lt;/select&gt;&lt;/label&gt;</w:t>
               <w:br/>
               <w:t xml:space="preserve">    &lt;/div&gt;</w:t>
               <w:br/>
@@ -2472,7 +2470,7 @@
               <w:br/>
               <w:t xml:space="preserve">        this.root = new THREE.Group();</w:t>
               <w:br/>
-              <w:t xml:space="preserve">        this.material = new THREE.MeshStandardMaterial({ color: '#3b82f6', roughness: 0.25, metalness: 0.65 });</w:t>
+              <w:t xml:space="preserve">        this.material = new THREE.MeshStandardMaterial({ color: '#3b82f6', roughness: 0.25, metalness: 0.65, flatShading: true });</w:t>
               <w:br/>
               <w:t xml:space="preserve">        this.set('box');</w:t>
               <w:br/>
@@ -2490,7 +2488,7 @@
               <w:br/>
               <w:t xml:space="preserve">        }</w:t>
               <w:br/>
-              <w:t xml:space="preserve">        const geometry = kind === 'box' ? new THREE.BoxGeometry(0.24, 0.24, 0.24) : new THREE.TorusKnotGeometry(0.09, 0.025, 96, 16);</w:t>
+              <w:t xml:space="preserve">        const geometry = kind === 'box' ? new THREE.BoxGeometry(0.24, 0.24, 0.24) : new THREE.ConeGeometry(0.17, 0.24, 4).rotateY(Math.PI / 4);</w:t>
               <w:br/>
               <w:t xml:space="preserve">        geometry.computeBoundingBox();</w:t>
               <w:br/>
@@ -2646,7 +2644,7 @@
               <w:br/>
               <w:t xml:space="preserve">            this.preview();</w:t>
               <w:br/>
-              <w:t xml:space="preserve">            element('status').textContent = 'Ошибка AR: ' + error.message;</w:t>
+              <w:t xml:space="preserve">            console.error('Ошибка AR:', error);</w:t>
               <w:br/>
               <w:t xml:space="preserve">        } finally {</w:t>
               <w:br/>
@@ -2691,13 +2689,14 @@
               <w:br/>
               <w:t>try { new ARApp(); }</w:t>
               <w:br/>
-              <w:t>catch (error) { element('status').textContent = 'Ошибка сцены: ' + error.message; }</w:t>
+              <w:t>catch (error) { console.error('Ошибка сцены:', error); }</w:t>
               <w:br/>
               <w:t>&lt;/script&gt;</w:t>
               <w:br/>
               <w:t>&lt;/body&gt;</w:t>
               <w:br/>
               <w:t>&lt;/html&gt;</w:t>
+              <w:br/>
             </w:r>
           </w:p>
         </w:tc>
@@ -2712,7 +2711,7 @@
         <w:rPr/>
       </w:pPr>
       <w:r>
-        <w:t>Интерфейс использует стандартное оформление браузера. Кнопки поворачивают модель на 15° влево или вправо, поле цвета изменяет material.color, а селектор заменяет геометрию. Положение и поворот группы root при замене сохраняются. CSS задаёт только размещение панели поверх холста и обработку указателя. Для работы панели в AR запрашивается DOM overlay; отмена события beforexrselect предотвращает размещение объекта при нажатии на элементы управления. Без AR модель доступна в режиме просмотра.</w:t>
+        <w:t>Интерфейс использует стандартное оформление браузера. Панель расположена внизу окна и имеет белый фон. Кнопки поворачивают модель на 15° влево или вправо, поле цвета изменяет material.color, а селектор заменяет геометрию. Положение и поворот группы root при замене сохраняются. CSS задаёт размещение и белый фон панели поверх холста, а также обработку указателя. Для работы панели в AR запрашивается DOM overlay; отмена события beforexrselect предотвращает размещение объекта при нажатии на элементы управления. Без AR модель доступна в режиме просмотра.</w:t>
       </w:r>
     </w:p>
     <w:p>
@@ -2756,7 +2755,7 @@
         <w:rPr/>
       </w:pPr>
       <w:r>
-        <w:t>Проверены синтаксис JavaScript и работа интерфейса в Chromium с программным рендерингом SwiftShader при размерах окна 390×844, 1280×720 и 844×390. Проверки подтвердили поворот, смену цвета и модели, отображение карты окружения и отсутствие ошибок браузера. На рисунке 1 показан исходный куб в режиме просмотра. На рисунке 2 показан зелёный торический узел после поворота на 45°.</w:t>
+        <w:t>Проверены синтаксис JavaScript и работа интерфейса в Chromium с программным рендерингом SwiftShader при размерах окна 390×844, 1280×960 и 844×390. Проверки подтвердили поворот в обе стороны, смену цвета и модели, наличие карты окружения и PBR-материала, размещение панели внизу окна и отсутствие ошибок JavaScript. На рисунке 1 показан исходный куб в режиме просмотра. На рисунке 2 показана зелёная четырёхугольная пирамида после поворота на 45°.</w:t>
       </w:r>
     </w:p>
     <w:p>
@@ -2870,7 +2869,7 @@
         <w:rPr/>
       </w:pPr>
       <w:r>
-        <w:t>Рисунок 2 – Замена модели, смена цвета и поворот торического узла на 45°</w:t>
+        <w:t>Рисунок 2 – Замена модели, смена цвета и поворот четырёхугольной пирамиды на 45°</w:t>
       </w:r>
       <w:r/>
     </w:p>
@@ -2927,7 +2926,7 @@
         <w:rPr/>
       </w:pPr>
       <w:r>
-        <w:t>В ходе практической работы №5 реализовано управление объектом: поворот кнопками, выбор цвета и замена куба на торический узел. Добавлены PBR-материал и карта окружения, а код разделён на классы в одном HTML-файле. Сохранены hit-test и размещение объекта из предыдущей практики. Браузерные проверки подтвердили работу интерфейса; логика размещения проверена на искусственных данных.</w:t>
+        <w:t>В ходе практической работы №5 реализовано управление объектом: поворот кнопками, выбор цвета и замена куба на четырёхугольную пирамиду. Добавлены PBR-материал и карта окружения, а код разделён на классы в одном HTML-файле. Стандартные элементы управления размещены на панели с белым фоном внизу окна. Сохранены hit-test и размещение объекта из предыдущей практики. Браузерные проверки подтвердили работу интерфейса; логика размещения проверена на искусственных данных.</w:t>
       </w:r>
     </w:p>
     <w:sectPr>

</xml_diff>

<commit_message>
Keep control labels with their fields on narrow screens
</commit_message>
<xml_diff>
--- a/docs/ЛиньковМВ_ПР5_РКПДР.docx
+++ b/docs/ЛиньковМВ_ПР5_РКПДР.docx
@@ -2404,6 +2404,8 @@
               <w:br/>
               <w:t>#controls { position: absolute; bottom: 8px; left: 8px; right: 8px; background: #fff; pointer-events: auto; }</w:t>
               <w:br/>
+              <w:t>#controls label { display: inline-block; }</w:t>
+              <w:br/>
               <w:t>&lt;/style&gt;</w:t>
               <w:br/>
               <w:t>&lt;script src="https://cdnjs.cloudflare.com/ajax/libs/three.js/r128/three.min.js"&gt;&lt;/script&gt;</w:t>
@@ -2711,7 +2713,7 @@
         <w:rPr/>
       </w:pPr>
       <w:r>
-        <w:t>Интерфейс использует стандартное оформление браузера. Панель расположена внизу окна и имеет белый фон. Кнопки поворачивают модель на 15° влево или вправо, поле цвета изменяет material.color, а селектор заменяет геометрию. Положение и поворот группы root при замене сохраняются. CSS задаёт размещение и белый фон панели поверх холста, а также обработку указателя. Для работы панели в AR запрашивается DOM overlay; отмена события beforexrselect предотвращает размещение объекта при нажатии на элементы управления. Без AR модель доступна в режиме просмотра.</w:t>
+        <w:t>Интерфейс использует стандартное оформление браузера. Панель расположена внизу окна и имеет белый фон. Подписи цвета и модели переносятся вместе со своими полями. Кнопки поворачивают модель на 15° влево или вправо, поле цвета изменяет material.color, а селектор заменяет геометрию. Положение и поворот группы root при замене сохраняются. CSS задаёт размещение и белый фон панели поверх холста, а также обработку указателя. Для работы панели в AR запрашивается DOM overlay; отмена события beforexrselect предотвращает размещение объекта при нажатии на элементы управления. Без AR модель доступна в режиме просмотра.</w:t>
       </w:r>
     </w:p>
     <w:p>

</xml_diff>

<commit_message>
Fit all AR controls in one row and update report
</commit_message>
<xml_diff>
--- a/docs/ЛиньковМВ_ПР5_РКПДР.docx
+++ b/docs/ЛиньковМВ_ПР5_РКПДР.docx
@@ -2402,9 +2402,9 @@
               <w:br/>
               <w:t>#overlay { position: fixed; inset: 0; pointer-events: none; }</w:t>
               <w:br/>
-              <w:t>#controls { position: absolute; bottom: 8px; left: 8px; right: 8px; background: #fff; pointer-events: auto; }</w:t>
+              <w:t>#controls { position: absolute; bottom: 8px; left: 8px; right: 8px; display: flex; align-items: center; gap: 4px; background: #fff; pointer-events: auto; }</w:t>
               <w:br/>
-              <w:t>#controls label { display: inline-block; }</w:t>
+              <w:t>#controls select { min-width: 0; }</w:t>
               <w:br/>
               <w:t>&lt;/style&gt;</w:t>
               <w:br/>
@@ -2424,9 +2424,9 @@
               <w:br/>
               <w:t xml:space="preserve">        &lt;button id="right" aria-label="Повернуть вправо на 15 градусов"&gt;+15°&lt;/button&gt;</w:t>
               <w:br/>
-              <w:t xml:space="preserve">        &lt;label&gt;Цвет &lt;input id="color" type="color" value="#3b82f6"&gt;&lt;/label&gt;</w:t>
+              <w:t xml:space="preserve">        &lt;input id="color" type="color" value="#3b82f6" aria-label="Цвет"&gt;</w:t>
               <w:br/>
-              <w:t xml:space="preserve">        &lt;label&gt;Модель &lt;select id="model"&gt;&lt;option value="box"&gt;Куб&lt;/option&gt;&lt;option value="pyramid"&gt;Пирамида&lt;/option&gt;&lt;/select&gt;&lt;/label&gt;</w:t>
+              <w:t xml:space="preserve">        &lt;select id="model" aria-label="Модель"&gt;&lt;option value="box"&gt;Куб&lt;/option&gt;&lt;option value="pyramid"&gt;Пирамида&lt;/option&gt;&lt;/select&gt;</w:t>
               <w:br/>
               <w:t xml:space="preserve">    &lt;/div&gt;</w:t>
               <w:br/>
@@ -2713,7 +2713,7 @@
         <w:rPr/>
       </w:pPr>
       <w:r>
-        <w:t>Интерфейс использует стандартное оформление браузера. Панель расположена внизу окна и имеет белый фон. Подписи цвета и модели переносятся вместе со своими полями. Кнопки поворачивают модель на 15° влево или вправо, поле цвета изменяет material.color, а селектор заменяет геометрию. Положение и поворот группы root при замене сохраняются. CSS задаёт размещение и белый фон панели поверх холста, а также обработку указателя. Для работы панели в AR запрашивается DOM overlay; отмена события beforexrselect предотвращает размещение объекта при нажатии на элементы управления. Без AR модель доступна в режиме просмотра.</w:t>
+        <w:t>Интерфейс использует стандартное оформление браузера. Панель расположена внизу окна и имеет белый фон. Все элементы расположены в одну строку с помощью flex. Отдельные подписи цвета и модели убраны для экономии места; названия полей заданы через aria-label. Кнопки поворачивают модель на 15° влево или вправо, поле цвета изменяет material.color, а селектор заменяет геометрию. Положение и поворот группы root при замене сохраняются. CSS задаёт размещение и белый фон панели поверх холста, а также обработку указателя. Для работы панели в AR запрашивается DOM overlay; отмена события beforexrselect предотвращает размещение объекта при нажатии на элементы управления. Без AR модель доступна в режиме просмотра.</w:t>
       </w:r>
     </w:p>
     <w:p>

</xml_diff>

<commit_message>
Restore project to version before white controls background
</commit_message>
<xml_diff>
--- a/docs/ЛиньковМВ_ПР5_РКПДР.docx
+++ b/docs/ЛиньковМВ_ПР5_РКПДР.docx
@@ -2331,7 +2331,7 @@
         <w:rPr/>
       </w:pPr>
       <w:r>
-        <w:t>Приложение реализовано в одном файле index.html на Three.js r128 и WebXR. Класс Lighting создаёт карту окружения через PMREMGenerator и назначает её scene.environment. Класс Model создаёт куб или четырёхугольную пирамиду с материалом MeshStandardMaterial (roughness = 0.25, metalness = 0.65). Пирамида задаётся через ConeGeometry с четырьмя сегментами основания; flatShading обеспечивает плоские грани. Класс Controls обрабатывает элементы управления, а ARApp управляет сессией immersive-ar, системой координат local-floor, hit-test и размещением объекта. Полный код приведён в листинге 1.</w:t>
+        <w:t>Приложение реализовано в одном файле index.html на Three.js r128 и WebXR. Класс Lighting создаёт карту окружения через PMREMGenerator и назначает её scene.environment. Класс Model создаёт куб или торический узел с материалом MeshStandardMaterial (roughness = 0.25, metalness = 0.65). Класс Controls обрабатывает элементы управления, а ARApp управляет сессией immersive-ar, системой координат local-floor, hit-test и размещением объекта. Полный код приведён в листинге 1.</w:t>
       </w:r>
     </w:p>
     <w:p>
@@ -2402,9 +2402,7 @@
               <w:br/>
               <w:t>#overlay { position: fixed; inset: 0; pointer-events: none; }</w:t>
               <w:br/>
-              <w:t>#controls { position: absolute; bottom: 8px; left: 8px; right: 8px; display: flex; align-items: center; gap: 4px; background: #fff; pointer-events: auto; }</w:t>
-              <w:br/>
-              <w:t>#controls select { min-width: 0; }</w:t>
+              <w:t>#controls { position: absolute; top: 8px; left: 8px; right: 8px; pointer-events: auto; background: white; }</w:t>
               <w:br/>
               <w:t>&lt;/style&gt;</w:t>
               <w:br/>
@@ -2424,9 +2422,11 @@
               <w:br/>
               <w:t xml:space="preserve">        &lt;button id="right" aria-label="Повернуть вправо на 15 градусов"&gt;+15°&lt;/button&gt;</w:t>
               <w:br/>
-              <w:t xml:space="preserve">        &lt;input id="color" type="color" value="#3b82f6" aria-label="Цвет"&gt;</w:t>
+              <w:t xml:space="preserve">        &lt;label&gt;Цвет &lt;input id="color" type="color" value="#3b82f6"&gt;&lt;/label&gt;</w:t>
               <w:br/>
-              <w:t xml:space="preserve">        &lt;select id="model" aria-label="Модель"&gt;&lt;option value="box"&gt;Куб&lt;/option&gt;&lt;option value="pyramid"&gt;Пирамида&lt;/option&gt;&lt;/select&gt;</w:t>
+              <w:t xml:space="preserve">        &lt;label&gt;Модель &lt;select id="model"&gt;&lt;option value="box"&gt;Куб&lt;/option&gt;&lt;option value="knot"&gt;Узел&lt;/option&gt;&lt;/select&gt;&lt;/label&gt;</w:t>
+              <w:br/>
+              <w:t xml:space="preserve">        &lt;p id="status" role="status"&gt;Просмотр модели. Для AR наведите камеру на поверхность и коснитесь зелёного кольца.&lt;/p&gt;</w:t>
               <w:br/>
               <w:t xml:space="preserve">    &lt;/div&gt;</w:t>
               <w:br/>
@@ -2472,7 +2472,7 @@
               <w:br/>
               <w:t xml:space="preserve">        this.root = new THREE.Group();</w:t>
               <w:br/>
-              <w:t xml:space="preserve">        this.material = new THREE.MeshStandardMaterial({ color: '#3b82f6', roughness: 0.25, metalness: 0.65, flatShading: true });</w:t>
+              <w:t xml:space="preserve">        this.material = new THREE.MeshStandardMaterial({ color: '#3b82f6', roughness: 0.25, metalness: 0.65 });</w:t>
               <w:br/>
               <w:t xml:space="preserve">        this.set('box');</w:t>
               <w:br/>
@@ -2490,7 +2490,7 @@
               <w:br/>
               <w:t xml:space="preserve">        }</w:t>
               <w:br/>
-              <w:t xml:space="preserve">        const geometry = kind === 'box' ? new THREE.BoxGeometry(0.24, 0.24, 0.24) : new THREE.ConeGeometry(0.17, 0.24, 4).rotateY(Math.PI / 4);</w:t>
+              <w:t xml:space="preserve">        const geometry = kind === 'box' ? new THREE.BoxGeometry(0.24, 0.24, 0.24) : new THREE.TorusKnotGeometry(0.09, 0.025, 96, 16);</w:t>
               <w:br/>
               <w:t xml:space="preserve">        geometry.computeBoundingBox();</w:t>
               <w:br/>
@@ -2646,7 +2646,7 @@
               <w:br/>
               <w:t xml:space="preserve">            this.preview();</w:t>
               <w:br/>
-              <w:t xml:space="preserve">            console.error('Ошибка AR:', error);</w:t>
+              <w:t xml:space="preserve">            element('status').textContent = 'Ошибка AR: ' + error.message;</w:t>
               <w:br/>
               <w:t xml:space="preserve">        } finally {</w:t>
               <w:br/>
@@ -2691,14 +2691,13 @@
               <w:br/>
               <w:t>try { new ARApp(); }</w:t>
               <w:br/>
-              <w:t>catch (error) { console.error('Ошибка сцены:', error); }</w:t>
+              <w:t>catch (error) { element('status').textContent = 'Ошибка сцены: ' + error.message; }</w:t>
               <w:br/>
               <w:t>&lt;/script&gt;</w:t>
               <w:br/>
               <w:t>&lt;/body&gt;</w:t>
               <w:br/>
               <w:t>&lt;/html&gt;</w:t>
-              <w:br/>
             </w:r>
           </w:p>
         </w:tc>
@@ -2713,7 +2712,7 @@
         <w:rPr/>
       </w:pPr>
       <w:r>
-        <w:t>Интерфейс использует стандартное оформление браузера. Панель расположена внизу окна и имеет белый фон. Все элементы расположены в одну строку с помощью flex. Отдельные подписи цвета и модели убраны для экономии места; названия полей заданы через aria-label. Кнопки поворачивают модель на 15° влево или вправо, поле цвета изменяет material.color, а селектор заменяет геометрию. Положение и поворот группы root при замене сохраняются. CSS задаёт размещение и белый фон панели поверх холста, а также обработку указателя. Для работы панели в AR запрашивается DOM overlay; отмена события beforexrselect предотвращает размещение объекта при нажатии на элементы управления. Без AR модель доступна в режиме просмотра.</w:t>
+        <w:t>Интерфейс использует стандартное оформление браузера. Кнопки поворачивают модель на 15° влево или вправо, поле цвета изменяет material.color, а селектор заменяет геометрию. Положение и поворот группы root при замене сохраняются. CSS задаёт только размещение панели поверх холста и обработку указателя. Для работы панели в AR запрашивается DOM overlay; отмена события beforexrselect предотвращает размещение объекта при нажатии на элементы управления. Без AR модель доступна в режиме просмотра.</w:t>
       </w:r>
     </w:p>
     <w:p>
@@ -2757,7 +2756,7 @@
         <w:rPr/>
       </w:pPr>
       <w:r>
-        <w:t>Проверены синтаксис JavaScript и работа интерфейса в Chromium с программным рендерингом SwiftShader при размерах окна 390×844, 1280×960 и 844×390. Проверки подтвердили поворот в обе стороны, смену цвета и модели, наличие карты окружения и PBR-материала, размещение панели внизу окна и отсутствие ошибок JavaScript. На рисунке 1 показан исходный куб в режиме просмотра. На рисунке 2 показана зелёная четырёхугольная пирамида после поворота на 45°.</w:t>
+        <w:t>Проверены синтаксис JavaScript и работа интерфейса в Chromium с программным рендерингом SwiftShader при размерах окна 390×844, 1280×720 и 844×390. Проверки подтвердили поворот, смену цвета и модели, отображение карты окружения и отсутствие ошибок браузера. На рисунке 1 показан исходный куб в режиме просмотра. На рисунке 2 показан зелёный торический узел после поворота на 45°.</w:t>
       </w:r>
     </w:p>
     <w:p>
@@ -2871,7 +2870,7 @@
         <w:rPr/>
       </w:pPr>
       <w:r>
-        <w:t>Рисунок 2 – Замена модели, смена цвета и поворот четырёхугольной пирамиды на 45°</w:t>
+        <w:t>Рисунок 2 – Замена модели, смена цвета и поворот торического узла на 45°</w:t>
       </w:r>
       <w:r/>
     </w:p>
@@ -2928,7 +2927,7 @@
         <w:rPr/>
       </w:pPr>
       <w:r>
-        <w:t>В ходе практической работы №5 реализовано управление объектом: поворот кнопками, выбор цвета и замена куба на четырёхугольную пирамиду. Добавлены PBR-материал и карта окружения, а код разделён на классы в одном HTML-файле. Стандартные элементы управления размещены на панели с белым фоном внизу окна. Сохранены hit-test и размещение объекта из предыдущей практики. Браузерные проверки подтвердили работу интерфейса; логика размещения проверена на искусственных данных.</w:t>
+        <w:t>В ходе практической работы №5 реализовано управление объектом: поворот кнопками, выбор цвета и замена куба на торический узел. Добавлены PBR-материал и карта окружения, а код разделён на классы в одном HTML-файле. Сохранены hit-test и размещение объекта из предыдущей практики. Браузерные проверки подтвердили работу интерфейса; логика размещения проверена на искусственных данных.</w:t>
       </w:r>
     </w:p>
     <w:sectPr>

</xml_diff>

<commit_message>
Keep transparent AR controls and labels in one responsive row
</commit_message>
<xml_diff>
--- a/docs/ЛиньковМВ_ПР5_РКПДР.docx
+++ b/docs/ЛиньковМВ_ПР5_РКПДР.docx
@@ -2331,7 +2331,7 @@
         <w:rPr/>
       </w:pPr>
       <w:r>
-        <w:t>Приложение реализовано в одном файле index.html на Three.js r128 и WebXR. Класс Lighting создаёт карту окружения через PMREMGenerator и назначает её scene.environment. Класс Model создаёт куб или торический узел с материалом MeshStandardMaterial (roughness = 0.25, metalness = 0.65). Класс Controls обрабатывает элементы управления, а ARApp управляет сессией immersive-ar, системой координат local-floor, hit-test и размещением объекта. Полный код приведён в листинге 1.</w:t>
+        <w:t>Приложение реализовано в одном файле index.html на Three.js r128 и WebXR. Класс Lighting создаёт карту окружения через PMREMGenerator и назначает её scene.environment. Класс Model создаёт куб или четырёхугольную пирамиду с материалом MeshStandardMaterial (roughness = 0.25, metalness = 0.65). Пирамида задаётся через ConeGeometry с четырьмя сегментами основания; flatShading обеспечивает плоские грани. Класс Controls обрабатывает элементы управления, а ARApp управляет сессией immersive-ar, системой координат local-floor, hit-test и размещением объекта. Полный код приведён в листинге 1.</w:t>
       </w:r>
     </w:p>
     <w:p>
@@ -2402,7 +2402,13 @@
               <w:br/>
               <w:t>#overlay { position: fixed; inset: 0; pointer-events: none; }</w:t>
               <w:br/>
-              <w:t>#controls { position: absolute; top: 8px; left: 8px; right: 8px; pointer-events: auto; background: white; }</w:t>
+              <w:t>#controls { position: absolute; bottom: 8px; left: 8px; right: 8px; display: flex; align-items: center; gap: 3px; white-space: nowrap; font-size: clamp(9px, 2.8vw, 14px); pointer-events: auto; }</w:t>
+              <w:br/>
+              <w:t>#controls label { display: flex; align-items: center; }</w:t>
+              <w:br/>
+              <w:t>#controls button, #controls input, #controls select { font-size: inherit; }</w:t>
+              <w:br/>
+              <w:t>#color { width: 32px; }</w:t>
               <w:br/>
               <w:t>&lt;/style&gt;</w:t>
               <w:br/>
@@ -2424,9 +2430,7 @@
               <w:br/>
               <w:t xml:space="preserve">        &lt;label&gt;Цвет &lt;input id="color" type="color" value="#3b82f6"&gt;&lt;/label&gt;</w:t>
               <w:br/>
-              <w:t xml:space="preserve">        &lt;label&gt;Модель &lt;select id="model"&gt;&lt;option value="box"&gt;Куб&lt;/option&gt;&lt;option value="knot"&gt;Узел&lt;/option&gt;&lt;/select&gt;&lt;/label&gt;</w:t>
-              <w:br/>
-              <w:t xml:space="preserve">        &lt;p id="status" role="status"&gt;Просмотр модели. Для AR наведите камеру на поверхность и коснитесь зелёного кольца.&lt;/p&gt;</w:t>
+              <w:t xml:space="preserve">        &lt;label&gt;Модель &lt;select id="model"&gt;&lt;option value="box"&gt;Куб&lt;/option&gt;&lt;option value="pyramid"&gt;Пирамида&lt;/option&gt;&lt;/select&gt;&lt;/label&gt;</w:t>
               <w:br/>
               <w:t xml:space="preserve">    &lt;/div&gt;</w:t>
               <w:br/>
@@ -2472,7 +2476,7 @@
               <w:br/>
               <w:t xml:space="preserve">        this.root = new THREE.Group();</w:t>
               <w:br/>
-              <w:t xml:space="preserve">        this.material = new THREE.MeshStandardMaterial({ color: '#3b82f6', roughness: 0.25, metalness: 0.65 });</w:t>
+              <w:t xml:space="preserve">        this.material = new THREE.MeshStandardMaterial({ color: '#3b82f6', roughness: 0.25, metalness: 0.65, flatShading: true });</w:t>
               <w:br/>
               <w:t xml:space="preserve">        this.set('box');</w:t>
               <w:br/>
@@ -2490,7 +2494,7 @@
               <w:br/>
               <w:t xml:space="preserve">        }</w:t>
               <w:br/>
-              <w:t xml:space="preserve">        const geometry = kind === 'box' ? new THREE.BoxGeometry(0.24, 0.24, 0.24) : new THREE.TorusKnotGeometry(0.09, 0.025, 96, 16);</w:t>
+              <w:t xml:space="preserve">        const geometry = kind === 'box' ? new THREE.BoxGeometry(0.24, 0.24, 0.24) : new THREE.ConeGeometry(0.17, 0.24, 4).rotateY(Math.PI / 4);</w:t>
               <w:br/>
               <w:t xml:space="preserve">        geometry.computeBoundingBox();</w:t>
               <w:br/>
@@ -2646,7 +2650,7 @@
               <w:br/>
               <w:t xml:space="preserve">            this.preview();</w:t>
               <w:br/>
-              <w:t xml:space="preserve">            element('status').textContent = 'Ошибка AR: ' + error.message;</w:t>
+              <w:t xml:space="preserve">            console.error('Ошибка AR:', error);</w:t>
               <w:br/>
               <w:t xml:space="preserve">        } finally {</w:t>
               <w:br/>
@@ -2691,13 +2695,14 @@
               <w:br/>
               <w:t>try { new ARApp(); }</w:t>
               <w:br/>
-              <w:t>catch (error) { element('status').textContent = 'Ошибка сцены: ' + error.message; }</w:t>
+              <w:t>catch (error) { console.error('Ошибка сцены:', error); }</w:t>
               <w:br/>
               <w:t>&lt;/script&gt;</w:t>
               <w:br/>
               <w:t>&lt;/body&gt;</w:t>
               <w:br/>
               <w:t>&lt;/html&gt;</w:t>
+              <w:br/>
             </w:r>
           </w:p>
         </w:tc>
@@ -2712,7 +2717,7 @@
         <w:rPr/>
       </w:pPr>
       <w:r>
-        <w:t>Интерфейс использует стандартное оформление браузера. Кнопки поворачивают модель на 15° влево или вправо, поле цвета изменяет material.color, а селектор заменяет геометрию. Положение и поворот группы root при замене сохраняются. CSS задаёт только размещение панели поверх холста и обработку указателя. Для работы панели в AR запрашивается DOM overlay; отмена события beforexrselect предотвращает размещение объекта при нажатии на элементы управления. Без AR модель доступна в режиме просмотра.</w:t>
+        <w:t>Интерфейс использует стандартное оформление браузера. Панель расположена внизу окна и имеет прозрачный фон. Все элементы, включая подписи «Цвет» и «Модель», расположены в одну строку с помощью flex. Размер текста адаптируется к ширине окна. Кнопки поворачивают модель на 15° влево или вправо, поле цвета изменяет material.color, а селектор заменяет геометрию. Положение и поворот группы root при замене сохраняются. CSS задаёт размещение панели поверх холста, размеры элементов и обработку указателя. Для работы панели в AR запрашивается DOM overlay; отмена события beforexrselect предотвращает размещение объекта при нажатии на элементы управления. Без AR модель доступна в режиме просмотра.</w:t>
       </w:r>
     </w:p>
     <w:p>
@@ -2756,7 +2761,7 @@
         <w:rPr/>
       </w:pPr>
       <w:r>
-        <w:t>Проверены синтаксис JavaScript и работа интерфейса в Chromium с программным рендерингом SwiftShader при размерах окна 390×844, 1280×720 и 844×390. Проверки подтвердили поворот, смену цвета и модели, отображение карты окружения и отсутствие ошибок браузера. На рисунке 1 показан исходный куб в режиме просмотра. На рисунке 2 показан зелёный торический узел после поворота на 45°.</w:t>
+        <w:t>Проверены синтаксис JavaScript и работа интерфейса в Chromium с программным рендерингом SwiftShader при размерах окна 390×844, 1280×960 и 844×390. Проверки подтвердили поворот в обе стороны, смену цвета и модели, наличие карты окружения и PBR-материала, размещение панели внизу окна и отсутствие ошибок JavaScript. На рисунке 1 показан исходный куб в режиме просмотра. На рисунке 2 показана зелёная четырёхугольная пирамида после поворота на 45°.</w:t>
       </w:r>
     </w:p>
     <w:p>
@@ -2870,7 +2875,7 @@
         <w:rPr/>
       </w:pPr>
       <w:r>
-        <w:t>Рисунок 2 – Замена модели, смена цвета и поворот торического узла на 45°</w:t>
+        <w:t>Рисунок 2 – Замена модели, смена цвета и поворот четырёхугольной пирамиды на 45°</w:t>
       </w:r>
       <w:r/>
     </w:p>
@@ -2927,7 +2932,7 @@
         <w:rPr/>
       </w:pPr>
       <w:r>
-        <w:t>В ходе практической работы №5 реализовано управление объектом: поворот кнопками, выбор цвета и замена куба на торический узел. Добавлены PBR-материал и карта окружения, а код разделён на классы в одном HTML-файле. Сохранены hit-test и размещение объекта из предыдущей практики. Браузерные проверки подтвердили работу интерфейса; логика размещения проверена на искусственных данных.</w:t>
+        <w:t>В ходе практической работы №5 реализовано управление объектом: поворот кнопками, выбор цвета и замена куба на четырёхугольную пирамиду. Добавлены PBR-материал и карта окружения, а код разделён на классы в одном HTML-файле. Стандартные элементы управления размещены в одну строку на прозрачной панели внизу окна. Сохранены hit-test и размещение объекта из предыдущей практики. Браузерные проверки подтвердили работу интерфейса; логика размещения проверена на искусственных данных.</w:t>
       </w:r>
     </w:p>
     <w:sectPr>

</xml_diff>

<commit_message>
Increase spacing between AR controls and update report
</commit_message>
<xml_diff>
--- a/docs/ЛиньковМВ_ПР5_РКПДР.docx
+++ b/docs/ЛиньковМВ_ПР5_РКПДР.docx
@@ -2402,13 +2402,15 @@
               <w:br/>
               <w:t>#overlay { position: fixed; inset: 0; pointer-events: none; }</w:t>
               <w:br/>
-              <w:t>#controls { position: absolute; bottom: 8px; left: 8px; right: 8px; display: flex; align-items: center; gap: 3px; white-space: nowrap; font-size: clamp(9px, 2.8vw, 14px); pointer-events: auto; }</w:t>
+              <w:t>#controls { position: absolute; bottom: 8px; left: 8px; right: 8px; display: flex; align-items: center; gap: 8px; white-space: nowrap; font-size: clamp(9px, 2.8vw, 14px); pointer-events: auto; }</w:t>
               <w:br/>
-              <w:t>#controls label { display: flex; align-items: center; }</w:t>
+              <w:t>#controls label { display: flex; align-items: center; gap: 4px; }</w:t>
               <w:br/>
               <w:t>#controls button, #controls input, #controls select { font-size: inherit; }</w:t>
               <w:br/>
               <w:t>#color { width: 32px; }</w:t>
+              <w:br/>
+              <w:t>@media (max-width: 360px) { #controls { gap: 4px; } #controls label { gap: 2px; } }</w:t>
               <w:br/>
               <w:t>&lt;/style&gt;</w:t>
               <w:br/>

</xml_diff>